<commit_message>
docs: rodada de texto da v3 (itens 53-55) e versao com revisoes aceitas
Identificacao espacial (nova 3.5.2), base por presenca (Quadro 7, 3.7),
H3 e envelopes (3.9), linha de base horaria (3.11), painel de demonstracao
(4.6.1, Quadros 12-14), banco (Quadros 15-16), casos de teste (Quadro 17),
limitacoes (6.3) e correcoes do levantamento (Quadros 1-3, referencias).
CLAUDE.md atualizado para a base v3-presenca.

Co-Authored-By: Claude Opus 5.5 <noreply@anthropic.com>
</commit_message>
<xml_diff>
--- a/Transicao_pre-projeto-para-TCC-Completo_TCC_Iluminacao_SP_v3_revisado.docx
+++ b/Transicao_pre-projeto-para-TCC-Completo_TCC_Iluminacao_SP_v3_revisado.docx
@@ -4319,8 +4319,24 @@
         <w:rPr>
           <w:lang w:val="pt-BR"/>
         </w:rPr>
-        <w:t xml:space="preserve">O problema é de integração e de decisão, não de sensoriamento nem de atuação. Em São Paulo, ambas já existem e estão documentadas na subseção 2.3: a plataforma Smart Sampa produz alertas automáticos de evento a partir de dezenas de milhares de câmeras, e a concessão de iluminação pública obriga a instalação de dispositivo de telegestão em cada uma das mais de seiscentas mil luminárias, com informação e controle de intensidade em tempo real. A informação é produzida em um sistema e a capacidade de agir sobre a luz existe em outro, e nada liga os dois.</w:t>
-      </w:r>
+        <w:t xml:space="preserve">O problema é de integração e de decisão, não de sensoriamento nem de atuação. Em São Paulo, ambas já existem e estão documentadas na subseção 2.3: a plataforma Smart Sampa produz alertas automáticos de evento a partir de dezenas de milhares de câmeras, e a concessão de iluminação pública obriga a instalação de dispositivo de telegestão em cada uma das mais de seiscentas mil luminárias, com informação e controle de intensidade em tempo real. A informação é produzida em um sistema e a capacidade de agir sobre a luz existe em outro, </w:t>
+      </w:r>
+      <w:del w:id="30000" w:author="Vitor Oliveira" w:date="2026-09-28T12:00:00Z">
+        <w:r>
+          <w:rPr>
+            <w:lang w:val="pt-BR"/>
+          </w:rPr>
+          <w:delText xml:space="preserve">e nada liga os dois.</w:delText>
+        </w:r>
+      </w:del>
+      <w:ins w:id="30001" w:author="Vitor Oliveira" w:date="2026-09-28T12:00:00Z">
+        <w:r>
+          <w:rPr>
+            <w:lang w:val="pt-BR"/>
+          </w:rPr>
+          <w:t xml:space="preserve">e nada, em operação, liga os dois.</w:t>
+        </w:r>
+      </w:ins>
     </w:p>
     <w:p>
       <w:pPr>
@@ -5262,13 +5278,51 @@
                 <w:lang w:val="pt-BR"/>
               </w:rPr>
             </w:pPr>
-            <w:r>
-              <w:rPr>
-                <w:sz w:val="20"/>
-                <w:szCs w:val="20"/>
-                <w:lang w:val="pt-BR"/>
-              </w:rPr>
-              <w:t>618.355 pontos de luz, dos quais 535.713 contratados para substituição por tecnologia de estado sólido; cerca de 90% do parque convertido em 2021, com modernização integral prevista para 2024</w:t>
+            <w:del w:id="30002" w:author="Vitor Oliveira" w:date="2026-09-28T12:00:00Z">
+              <w:r>
+                <w:rPr>
+                  <w:sz w:val="20"/>
+                  <w:szCs w:val="20"/>
+                  <w:lang w:val="pt-BR"/>
+                </w:rPr>
+                <w:delText xml:space="preserve">618.355 pontos de luz, dos quais</w:delText>
+              </w:r>
+            </w:del>
+            <w:ins w:id="30003" w:author="Vitor Oliveira" w:date="2026-09-28T12:00:00Z">
+              <w:r>
+                <w:rPr>
+                  <w:sz w:val="20"/>
+                  <w:szCs w:val="20"/>
+                  <w:lang w:val="pt-BR"/>
+                </w:rPr>
+                <w:t xml:space="preserve">618.355 pontos de luz na licitação, dos quais</w:t>
+              </w:r>
+            </w:ins>
+            <w:r>
+              <w:rPr>
+                <w:sz w:val="20"/>
+                <w:szCs w:val="20"/>
+                <w:lang w:val="pt-BR"/>
+              </w:rPr>
+              <w:t xml:space="preserve"> 535.713 contratados para substituição por tecnologia de estado sólido</w:t>
+            </w:r>
+            <w:ins w:id="30004" w:author="Vitor Oliveira" w:date="2026-09-28T12:00:00Z">
+              <w:r>
+                <w:rPr>
+                  <w:sz w:val="20"/>
+                  <w:szCs w:val="20"/>
+                  <w:lang w:val="pt-BR"/>
+                </w:rPr>
+                <w:t xml:space="preserve">; 662.945 pontos no cadastro georreferenciado municipal, cada um com placa e coordenadas, na carga de julho de 2026</w:t>
+              </w:r>
+            </w:ins>
+            <w:r>
+              <w:rPr>
+                <w:sz w:val="20"/>
+                <w:szCs w:val="20"/>
+                <w:lang w:val="pt-BR"/>
+              </w:rPr>
+              <w:t xml:space="preserve">; cerca de 90% do parque convertido em 2021, com modernização integral prevista para 2024</w:t>
             </w:r>
           </w:p>
         </w:tc>
@@ -5410,13 +5464,33 @@
                 <w:lang w:val="pt-BR"/>
               </w:rPr>
             </w:pPr>
-            <w:r>
-              <w:rPr>
-                <w:sz w:val="20"/>
-                <w:szCs w:val="20"/>
-                <w:lang w:val="pt-BR"/>
-              </w:rPr>
-              <w:t>40 mil câmeras integradas até setembro de 2025, sendo 20 mil municipais e 20 mil de redes privadas, e central de monitoramento em operação contínua. O Termo de Referência exige analíticos de contagem de pessoas, de detecção de densidade e concentração de pessoas, de contagem e fluxo de veículos e de alarme de congestionamento, além de interoperabilidade com acesso aos dados por interface de programação</w:t>
+            <w:del w:id="30005" w:author="Vitor Oliveira" w:date="2026-09-28T12:00:00Z">
+              <w:r>
+                <w:rPr>
+                  <w:sz w:val="20"/>
+                  <w:szCs w:val="20"/>
+                  <w:lang w:val="pt-BR"/>
+                </w:rPr>
+                <w:delText xml:space="preserve">40 mil câmeras integradas até setembro de 2025, sendo 20 mil municipais e 20 mil de redes privadas,</w:delText>
+              </w:r>
+            </w:del>
+            <w:ins w:id="30006" w:author="Vitor Oliveira" w:date="2026-09-28T12:00:00Z">
+              <w:r>
+                <w:rPr>
+                  <w:sz w:val="20"/>
+                  <w:szCs w:val="20"/>
+                  <w:lang w:val="pt-BR"/>
+                </w:rPr>
+                <w:t xml:space="preserve">50 mil câmeras integradas em abril de 2026 — eram 40 mil em setembro de 2025, metade municipais e metade de redes privadas —,</w:t>
+              </w:r>
+            </w:ins>
+            <w:r>
+              <w:rPr>
+                <w:sz w:val="20"/>
+                <w:szCs w:val="20"/>
+                <w:lang w:val="pt-BR"/>
+              </w:rPr>
+              <w:t xml:space="preserve"> e central de monitoramento em operação contínua. O Termo de Referência exige analíticos de contagem de pessoas, de detecção de densidade e concentração de pessoas, de contagem e fluxo de veículos e de alarme de congestionamento, além de interoperabilidade com acesso aos dados por interface de programação</w:t>
             </w:r>
           </w:p>
         </w:tc>
@@ -5442,8 +5516,28 @@
                 <w:szCs w:val="20"/>
                 <w:lang w:val="pt-BR"/>
               </w:rPr>
-              <w:t>Destina-se à segurança pública. Sua informação não alcança qualquer outro sistema municipal, e o acesso à interface é tratado caso a caso, sem endpoint público</w:t>
-            </w:r>
+              <w:t xml:space="preserve">Destina-se à segurança pública. </w:t>
+            </w:r>
+            <w:del w:id="30007" w:author="Vitor Oliveira" w:date="2026-09-28T12:00:00Z">
+              <w:r>
+                <w:rPr>
+                  <w:sz w:val="20"/>
+                  <w:szCs w:val="20"/>
+                  <w:lang w:val="pt-BR"/>
+                </w:rPr>
+                <w:delText xml:space="preserve">Sua informação não alcança qualquer outro sistema municipal, e o acesso à interface é tratado caso a caso, sem endpoint público</w:delText>
+              </w:r>
+            </w:del>
+            <w:ins w:id="30008" w:author="Vitor Oliveira" w:date="2026-09-28T12:00:00Z">
+              <w:r>
+                <w:rPr>
+                  <w:sz w:val="20"/>
+                  <w:szCs w:val="20"/>
+                  <w:lang w:val="pt-BR"/>
+                </w:rPr>
+                <w:t xml:space="preserve">O termo de referência prevê integração com outros sistemas municipais, entre eles o de iluminação pública, mas não há registro público de que ela opere, e o acesso à interface é tratado caso a caso, sem endpoint público</w:t>
+              </w:r>
+            </w:ins>
           </w:p>
         </w:tc>
       </w:tr>
@@ -5609,7 +5703,35 @@
           <w:szCs w:val="20"/>
           <w:lang w:val="pt-BR"/>
         </w:rPr>
-        <w:t>Fonte: Elaborado pelos autores (2026) a partir de São Paulo (2015, 2018a, 2021, 2022, 2025, 2026) e Agência Nacional de Energia Elétrica (2022).</w:t>
+        <w:t xml:space="preserve">Fonte: Elaborado pelos autores (2026) a partir de São Paulo (2015, 2018a, 2021, 2022, </w:t>
+      </w:r>
+      <w:del w:id="30009" w:author="Vitor Oliveira" w:date="2026-09-28T12:00:00Z">
+        <w:r>
+          <w:rPr>
+            <w:sz w:val="20"/>
+            <w:szCs w:val="20"/>
+            <w:lang w:val="pt-BR"/>
+          </w:rPr>
+          <w:delText xml:space="preserve">2025, 2026)</w:delText>
+        </w:r>
+      </w:del>
+      <w:ins w:id="30010" w:author="Vitor Oliveira" w:date="2026-09-28T12:00:00Z">
+        <w:r>
+          <w:rPr>
+            <w:sz w:val="20"/>
+            <w:szCs w:val="20"/>
+            <w:lang w:val="pt-BR"/>
+          </w:rPr>
+          <w:t xml:space="preserve">2025, 2026a, 2026b, 2026c)</w:t>
+        </w:r>
+      </w:ins>
+      <w:r>
+        <w:rPr>
+          <w:sz w:val="20"/>
+          <w:szCs w:val="20"/>
+          <w:lang w:val="pt-BR"/>
+        </w:rPr>
+        <w:t xml:space="preserve"> e Agência Nacional de Energia Elétrica (2022).</w:t>
       </w:r>
     </w:p>
     <w:p>
@@ -5675,6 +5797,24 @@
         </w:rPr>
         <w:t>O mesmo documento estabelece que a plataforma deve ser interoperável, de modo que seus dados possam ser acessados por interface de programação. A capacidade de publicação está, portanto, contratualmente prevista; o que não existe é o consumidor do outro lado, nem a semântica que tornaria esse consumo útil a um serviço distinto da segurança pública.</w:t>
       </w:r>
+    </w:p>
+    <w:p>
+      <w:pPr>
+        <w:spacing w:after="120" w:line="360" w:lineRule="auto"/>
+        <w:ind w:firstLine="709"/>
+        <w:jc w:val="both"/>
+        <w:rPr>
+          <w:ins w:id="30011" w:author="Vitor Oliveira" w:date="2026-09-28T12:00:00Z"/>
+        </w:rPr>
+      </w:pPr>
+      <w:ins w:id="30012" w:author="Vitor Oliveira" w:date="2026-09-28T12:00:00Z">
+        <w:r>
+          <w:rPr>
+            <w:lang w:val="pt-BR"/>
+          </w:rPr>
+          <w:t xml:space="preserve">O Anexo XI do mesmo termo vai além e relaciona a iluminação pública entre os sistemas com os quais a plataforma deve integrar-se, nos dois sentidos (SÃO PAULO, 2022, Anexo XI). O documento não especifica, porém, que dado trafegaria nem que decisão ele sustentaria, e não há registro público de que essa integração esteja em operação. A previsão contratual reforça a viabilidade do que aqui se propõe e não preenche a lacuna: o que falta continua sendo a camada que converte a descrição da via em nível de iluminação.</w:t>
+        </w:r>
+      </w:ins>
     </w:p>
     <w:p>
       <w:pPr>
@@ -6582,7 +6722,29 @@
         <w:rPr>
           <w:lang w:val="pt-BR"/>
         </w:rPr>
-        <w:t>Interface de dados urbanos. Serviço que emula a interface de programação de uma plataforma municipal de monitoramento, publicando eventos que descrevem o estado da via. Sua existência decorre de o Smart Sampa não disponibilizar interface pública, e sua especificação é, ela própria, um resultado do trabalho: define o que uma plataforma precisaria publicar para que um sistema de iluminação pudesse consumi-la.</w:t>
+        <w:t xml:space="preserve">Interface de dados urbanos. Serviço que emula a interface de programação de uma plataforma municipal de monitoramento, </w:t>
+      </w:r>
+      <w:del w:id="30013" w:author="Vitor Oliveira" w:date="2026-09-28T12:00:00Z">
+        <w:r>
+          <w:rPr>
+            <w:lang w:val="pt-BR"/>
+          </w:rPr>
+          <w:delText xml:space="preserve">publicando eventos que descrevem o estado da via.</w:delText>
+        </w:r>
+      </w:del>
+      <w:ins w:id="30014" w:author="Vitor Oliveira" w:date="2026-09-28T12:00:00Z">
+        <w:r>
+          <w:rPr>
+            <w:lang w:val="pt-BR"/>
+          </w:rPr>
+          <w:t xml:space="preserve">publicando, para cada trecho de via, leituras que descrevem o seu estado — pessoas presentes e ocorrência reportada —, identificado no cadastro municipal de logradouros (3.5.2).</w:t>
+        </w:r>
+      </w:ins>
+      <w:r>
+        <w:rPr>
+          <w:lang w:val="pt-BR"/>
+        </w:rPr>
+        <w:t xml:space="preserve"> Sua existência decorre de o Smart Sampa não disponibilizar interface pública, e sua especificação é, ela própria, um resultado do trabalho: define o que uma plataforma precisaria publicar para que um sistema de iluminação pudesse consumi-la.</w:t>
       </w:r>
     </w:p>
     <w:p>
@@ -7308,14 +7470,26 @@
                 <w:lang w:val="pt-BR"/>
               </w:rPr>
             </w:pPr>
-            <w:r>
-              <w:rPr>
-                <w:sz w:val="20"/>
-                <w:szCs w:val="20"/>
-                <w:lang w:val="pt-BR"/>
-              </w:rPr>
-              <w:t>Substituído pelo controlador alojado na tomada do relé fotocontrolador, normalizada pela ABNT NBR 5123</w:t>
-            </w:r>
+            <w:del w:id="30015" w:author="Vitor Oliveira" w:date="2026-09-28T12:00:00Z">
+              <w:r>
+                <w:rPr>
+                  <w:sz w:val="20"/>
+                  <w:szCs w:val="20"/>
+                  <w:lang w:val="pt-BR"/>
+                </w:rPr>
+                <w:delText>Substituído pelo controlador alojado na tomada do relé fotocontrolador, normalizada pela ABNT NBR 5123</w:delText>
+              </w:r>
+            </w:del>
+            <w:ins w:id="30016" w:author="Vitor Oliveira" w:date="2026-09-28T12:00:00Z">
+              <w:r>
+                <w:rPr>
+                  <w:sz w:val="20"/>
+                  <w:szCs w:val="20"/>
+                  <w:lang w:val="pt-BR"/>
+                </w:rPr>
+                <w:t xml:space="preserve">Substituído pelo controlador alojado na tomada da luminária, de sete contatos no padrão ANSI C136.41, exigida pelo Caderno de Encargos</w:t>
+              </w:r>
+            </w:ins>
           </w:p>
         </w:tc>
       </w:tr>
@@ -8452,6 +8626,9 @@
         </w:tc>
       </w:tr>
       <w:tr>
+        <w:trPr>
+          <w:ins w:id="30017" w:author="Vitor Oliveira" w:date="2026-09-28T12:00:00Z"/>
+        </w:trPr>
         <w:tc>
           <w:tcPr>
             <w:tcW w:w="2150" w:type="dxa"/>
@@ -8463,13 +8640,21 @@
             </w:tcMar>
           </w:tcPr>
           <w:p>
-            <w:r>
-              <w:rPr>
-                <w:sz w:val="20"/>
-                <w:szCs w:val="20"/>
-              </w:rPr>
-              <w:t>Interface elétrica de dimerização</w:t>
-            </w:r>
+            <w:pPr>
+              <w:rPr>
+                <w:ins w:id="30018" w:author="Vitor Oliveira" w:date="2026-09-28T12:00:00Z"/>
+              </w:rPr>
+            </w:pPr>
+            <w:ins w:id="30019" w:author="Vitor Oliveira" w:date="2026-09-28T12:00:00Z">
+              <w:r>
+                <w:rPr>
+                  <w:sz w:val="20"/>
+                  <w:szCs w:val="20"/>
+                  <w:lang w:val="pt-BR"/>
+                </w:rPr>
+                <w:t xml:space="preserve">Endereçamento do ponto de luz</w:t>
+              </w:r>
+            </w:ins>
           </w:p>
         </w:tc>
         <w:tc>
@@ -8485,17 +8670,19 @@
           <w:p>
             <w:pPr>
               <w:rPr>
-                <w:lang w:val="pt-BR"/>
+                <w:ins w:id="30020" w:author="Vitor Oliveira" w:date="2026-09-28T12:00:00Z"/>
               </w:rPr>
             </w:pPr>
-            <w:r>
-              <w:rPr>
-                <w:sz w:val="20"/>
-                <w:szCs w:val="20"/>
-                <w:lang w:val="pt-BR"/>
-              </w:rPr>
-              <w:t>Modulação por largura de pulso, conversível a 0 V–10 V pela cadeia de 3.4.1</w:t>
-            </w:r>
+            <w:ins w:id="30021" w:author="Vitor Oliveira" w:date="2026-09-28T12:00:00Z">
+              <w:r>
+                <w:rPr>
+                  <w:sz w:val="20"/>
+                  <w:szCs w:val="20"/>
+                  <w:lang w:val="pt-BR"/>
+                </w:rPr>
+                <w:t xml:space="preserve">Cadastro de trechos de via e de postes do município, associados por distância (3.5.2)</w:t>
+              </w:r>
+            </w:ins>
           </w:p>
         </w:tc>
         <w:tc>
@@ -8511,17 +8698,19 @@
           <w:p>
             <w:pPr>
               <w:rPr>
-                <w:lang w:val="pt-BR"/>
+                <w:ins w:id="30022" w:author="Vitor Oliveira" w:date="2026-09-28T12:00:00Z"/>
               </w:rPr>
             </w:pPr>
-            <w:r>
-              <w:rPr>
-                <w:sz w:val="20"/>
-                <w:szCs w:val="20"/>
-                <w:lang w:val="pt-BR"/>
-              </w:rPr>
-              <w:t>Controlador em tomada normalizada acionando o driver por 0 V–10 V</w:t>
-            </w:r>
+            <w:ins w:id="30023" w:author="Vitor Oliveira" w:date="2026-09-28T12:00:00Z">
+              <w:r>
+                <w:rPr>
+                  <w:sz w:val="20"/>
+                  <w:szCs w:val="20"/>
+                  <w:lang w:val="pt-BR"/>
+                </w:rPr>
+                <w:t xml:space="preserve">Código cadastral do ponto no cadastro técnico que a telegestão emprega</w:t>
+              </w:r>
+            </w:ins>
           </w:p>
         </w:tc>
         <w:tc>
@@ -8537,17 +8726,18 @@
           <w:p>
             <w:pPr>
               <w:rPr>
-                <w:lang w:val="pt-BR"/>
+                <w:ins w:id="30024" w:author="Vitor Oliveira" w:date="2026-09-28T12:00:00Z"/>
               </w:rPr>
             </w:pPr>
-            <w:r>
-              <w:rPr>
-                <w:sz w:val="20"/>
-                <w:szCs w:val="20"/>
-                <w:lang w:val="pt-BR"/>
-              </w:rPr>
-              <w:t>Contratado. Cláusula 6.2.1.B; tomada normalizada pela ABNT NBR 5123</w:t>
-            </w:r>
+            <w:ins w:id="30025" w:author="Vitor Oliveira" w:date="2026-09-28T12:00:00Z">
+              <w:r>
+                <w:rPr>
+                  <w:sz w:val="20"/>
+                  <w:szCs w:val="20"/>
+                </w:rPr>
+                <w:t xml:space="preserve">Contratado. Caderno de Encargos, itens 13 e 13.3; cadastro publicado no GeoSampa</w:t>
+              </w:r>
+            </w:ins>
           </w:p>
         </w:tc>
       </w:tr>
@@ -8568,7 +8758,7 @@
                 <w:sz w:val="20"/>
                 <w:szCs w:val="20"/>
               </w:rPr>
-              <w:t>Conhecimento da iluminância entregue</w:t>
+              <w:t>Interface elétrica de dimerização</w:t>
             </w:r>
           </w:p>
         </w:tc>
@@ -8594,7 +8784,7 @@
                 <w:szCs w:val="20"/>
                 <w:lang w:val="pt-BR"/>
               </w:rPr>
-              <w:t>Tabela de calibração levantada por medição</w:t>
+              <w:t>Modulação por largura de pulso, conversível a 0 V–10 V pela cadeia de 3.4.1</w:t>
             </w:r>
           </w:p>
         </w:tc>
@@ -8620,7 +8810,7 @@
                 <w:szCs w:val="20"/>
                 <w:lang w:val="pt-BR"/>
               </w:rPr>
-              <w:t>Certificação fotométrica da luminária e projeto luminotécnico</w:t>
+              <w:t>Controlador em tomada normalizada acionando o driver por 0 V–10 V</w:t>
             </w:r>
           </w:p>
         </w:tc>
@@ -8635,13 +8825,31 @@
             </w:tcMar>
           </w:tcPr>
           <w:p>
-            <w:r>
-              <w:rPr>
-                <w:sz w:val="20"/>
-                <w:szCs w:val="20"/>
-              </w:rPr>
-              <w:t>Certificação compulsória desde 2022</w:t>
-            </w:r>
+            <w:pPr>
+              <w:rPr>
+                <w:lang w:val="pt-BR"/>
+              </w:rPr>
+            </w:pPr>
+            <w:del w:id="30026" w:author="Vitor Oliveira" w:date="2026-09-28T12:00:00Z">
+              <w:r>
+                <w:rPr>
+                  <w:sz w:val="20"/>
+                  <w:szCs w:val="20"/>
+                  <w:lang w:val="pt-BR"/>
+                </w:rPr>
+                <w:delText>Contratado. Cláusula 6.2.1.B; tomada normalizada pela ABNT NBR 5123</w:delText>
+              </w:r>
+            </w:del>
+            <w:ins w:id="30027" w:author="Vitor Oliveira" w:date="2026-09-28T12:00:00Z">
+              <w:r>
+                <w:rPr>
+                  <w:sz w:val="20"/>
+                  <w:szCs w:val="20"/>
+                  <w:lang w:val="pt-BR"/>
+                </w:rPr>
+                <w:t xml:space="preserve">Contratado. Cláusula 6.2.1.B; tomada de sete contatos no padrão ANSI C136.41</w:t>
+              </w:r>
+            </w:ins>
           </w:p>
         </w:tc>
       </w:tr>
@@ -8657,6 +8865,100 @@
             </w:tcMar>
           </w:tcPr>
           <w:p>
+            <w:r>
+              <w:rPr>
+                <w:sz w:val="20"/>
+                <w:szCs w:val="20"/>
+              </w:rPr>
+              <w:t>Conhecimento da iluminância entregue</w:t>
+            </w:r>
+          </w:p>
+        </w:tc>
+        <w:tc>
+          <w:tcPr>
+            <w:tcW w:w="2200" w:type="dxa"/>
+            <w:tcMar>
+              <w:top w:w="70" w:type="dxa"/>
+              <w:left w:w="90" w:type="dxa"/>
+              <w:bottom w:w="70" w:type="dxa"/>
+              <w:right w:w="90" w:type="dxa"/>
+            </w:tcMar>
+          </w:tcPr>
+          <w:p>
+            <w:pPr>
+              <w:rPr>
+                <w:lang w:val="pt-BR"/>
+              </w:rPr>
+            </w:pPr>
+            <w:r>
+              <w:rPr>
+                <w:sz w:val="20"/>
+                <w:szCs w:val="20"/>
+                <w:lang w:val="pt-BR"/>
+              </w:rPr>
+              <w:t>Tabela de calibração levantada por medição</w:t>
+            </w:r>
+          </w:p>
+        </w:tc>
+        <w:tc>
+          <w:tcPr>
+            <w:tcW w:w="2400" w:type="dxa"/>
+            <w:tcMar>
+              <w:top w:w="70" w:type="dxa"/>
+              <w:left w:w="90" w:type="dxa"/>
+              <w:bottom w:w="70" w:type="dxa"/>
+              <w:right w:w="90" w:type="dxa"/>
+            </w:tcMar>
+          </w:tcPr>
+          <w:p>
+            <w:pPr>
+              <w:rPr>
+                <w:lang w:val="pt-BR"/>
+              </w:rPr>
+            </w:pPr>
+            <w:r>
+              <w:rPr>
+                <w:sz w:val="20"/>
+                <w:szCs w:val="20"/>
+                <w:lang w:val="pt-BR"/>
+              </w:rPr>
+              <w:t>Certificação fotométrica da luminária e projeto luminotécnico</w:t>
+            </w:r>
+          </w:p>
+        </w:tc>
+        <w:tc>
+          <w:tcPr>
+            <w:tcW w:w="2321" w:type="dxa"/>
+            <w:tcMar>
+              <w:top w:w="70" w:type="dxa"/>
+              <w:left w:w="90" w:type="dxa"/>
+              <w:bottom w:w="70" w:type="dxa"/>
+              <w:right w:w="90" w:type="dxa"/>
+            </w:tcMar>
+          </w:tcPr>
+          <w:p>
+            <w:r>
+              <w:rPr>
+                <w:sz w:val="20"/>
+                <w:szCs w:val="20"/>
+              </w:rPr>
+              <w:t>Certificação compulsória desde 2022</w:t>
+            </w:r>
+          </w:p>
+        </w:tc>
+      </w:tr>
+      <w:tr>
+        <w:tc>
+          <w:tcPr>
+            <w:tcW w:w="2150" w:type="dxa"/>
+            <w:tcMar>
+              <w:top w:w="70" w:type="dxa"/>
+              <w:left w:w="90" w:type="dxa"/>
+              <w:bottom w:w="70" w:type="dxa"/>
+              <w:right w:w="90" w:type="dxa"/>
+            </w:tcMar>
+          </w:tcPr>
+          <w:p>
             <w:pPr>
               <w:rPr>
                 <w:lang w:val="pt-BR"/>
@@ -8765,7 +9067,35 @@
           <w:szCs w:val="20"/>
           <w:lang w:val="pt-BR"/>
         </w:rPr>
-        <w:t>Fonte: Elaborado pelos autores (2026) a partir de São Paulo (2015, 2022), Associação Brasileira de Normas Técnicas (2016) e Instituto Nacional de Metrologia, Qualidade e Tecnologia (2022a, 2022b).</w:t>
+        <w:t xml:space="preserve">Fonte: Elaborado pelos autores (2026) a partir de São Paulo (2015, 2022), </w:t>
+      </w:r>
+      <w:del w:id="30028" w:author="Vitor Oliveira" w:date="2026-09-28T12:00:00Z">
+        <w:r>
+          <w:rPr>
+            <w:sz w:val="20"/>
+            <w:szCs w:val="20"/>
+            <w:lang w:val="pt-BR"/>
+          </w:rPr>
+          <w:delText xml:space="preserve">Associação Brasileira de Normas Técnicas (2016)</w:delText>
+        </w:r>
+      </w:del>
+      <w:ins w:id="30029" w:author="Vitor Oliveira" w:date="2026-09-28T12:00:00Z">
+        <w:r>
+          <w:rPr>
+            <w:sz w:val="20"/>
+            <w:szCs w:val="20"/>
+            <w:lang w:val="pt-BR"/>
+          </w:rPr>
+          <w:t xml:space="preserve">Associação Brasileira de Normas Técnicas (2016), American National Standards Institute (2013)</w:t>
+        </w:r>
+      </w:ins>
+      <w:r>
+        <w:rPr>
+          <w:sz w:val="20"/>
+          <w:szCs w:val="20"/>
+          <w:lang w:val="pt-BR"/>
+        </w:rPr>
+        <w:t xml:space="preserve"> e Instituto Nacional de Metrologia, Qualidade e Tecnologia (2022a, 2022b).</w:t>
       </w:r>
     </w:p>
     <w:p>
@@ -8781,7 +9111,51 @@
         <w:rPr>
           <w:lang w:val="pt-BR"/>
         </w:rPr>
-        <w:t xml:space="preserve">A leitura do quadro responde à objeção mais provável a um trabalho desta natureza, a de que a demonstração em bancada não estabeleceria a aplicabilidade em campo. De nove elos da cadeia, seis já existem: estão contratados, normalizados ou em operação, e nenhum deles é proposto por este trabalho. Três não existem — a decisão, a verificação normativa e o registro auditável —, e são exatamente os três que o trabalho constrói. A bancada não demonstra que os seis primeiros são possíveis, porque não precisa: eles são fato documentado em contrato e em regulamento. Ela demonstra que os três últimos funcionam e que sua saída alcança o mundo físico de forma mensurável.</w:t>
+        <w:t xml:space="preserve">A leitura do quadro responde à objeção mais provável a um trabalho desta natureza, a de que a demonstração em bancada não estabeleceria a aplicabilidade em campo. </w:t>
+      </w:r>
+      <w:del w:id="30030" w:author="Vitor Oliveira" w:date="2026-09-28T12:00:00Z">
+        <w:r>
+          <w:rPr>
+            <w:lang w:val="pt-BR"/>
+          </w:rPr>
+          <w:delText xml:space="preserve">De nove elos da cadeia, seis já existem</w:delText>
+        </w:r>
+      </w:del>
+      <w:ins w:id="30031" w:author="Vitor Oliveira" w:date="2026-09-28T12:00:00Z">
+        <w:r>
+          <w:rPr>
+            <w:lang w:val="pt-BR"/>
+          </w:rPr>
+          <w:t xml:space="preserve">De dez elos da cadeia, sete já existem</w:t>
+        </w:r>
+      </w:ins>
+      <w:r>
+        <w:rPr>
+          <w:lang w:val="pt-BR"/>
+        </w:rPr>
+        <w:t xml:space="preserve">: estão contratados, normalizados ou em operação, e nenhum deles é proposto por este trabalho. Três não existem — a decisão, a verificação normativa e o registro auditável —, e são exatamente os três que o trabalho constrói. </w:t>
+      </w:r>
+      <w:del w:id="30032" w:author="Vitor Oliveira" w:date="2026-09-28T12:00:00Z">
+        <w:r>
+          <w:rPr>
+            <w:lang w:val="pt-BR"/>
+          </w:rPr>
+          <w:delText xml:space="preserve">A bancada não demonstra que os seis primeiros</w:delText>
+        </w:r>
+      </w:del>
+      <w:ins w:id="30033" w:author="Vitor Oliveira" w:date="2026-09-28T12:00:00Z">
+        <w:r>
+          <w:rPr>
+            <w:lang w:val="pt-BR"/>
+          </w:rPr>
+          <w:t xml:space="preserve">A bancada não demonstra que os sete primeiros</w:t>
+        </w:r>
+      </w:ins>
+      <w:r>
+        <w:rPr>
+          <w:lang w:val="pt-BR"/>
+        </w:rPr>
+        <w:t xml:space="preserve"> são possíveis, porque não precisa: eles são fato documentado em contrato e em regulamento. Ela demonstra que os três últimos funcionam e que sua saída alcança o mundo físico de forma mensurável.</w:t>
       </w:r>
     </w:p>
     <w:p>
@@ -8797,7 +9171,29 @@
         <w:rPr>
           <w:lang w:val="pt-BR"/>
         </w:rPr>
-        <w:t>Duas delimitações fecham a subseção. A primeira é que a correspondência aqui estabelecida é funcional e topológica — um serviço central decide, o ponto de luz executa e reporta —, e não de escala, de potência, de geometria fotométrica, de instrumentação nem de enlace; essas divergências figuram entre as limitações e nenhuma delas incide sobre a camada avaliada. A segunda é que os autores não tiveram acesso ao equipamento efetivamente instalado pela concessionária: a cadeia descrita apoia-se no que o contrato exige desse equipamento e no que a normalização brasileira impõe a ele — a tomada normalizada do relé fotocontrolador (ASSOCIAÇÃO BRASILEIRA DE NORMAS TÉCNICAS, 2016), a certificação compulsória da luminária viária (INSTITUTO NACIONAL DE METROLOGIA, QUALIDADE E TECNOLOGIA, 2022a) e a regulamentação metrológica da medição de energia no ponto de luz (INSTITUTO NACIONAL DE METROLOGIA, QUALIDADE E TECNOLOGIA, 2022b) —, todos documentos públicos, e não em sua inspeção. O modelo do controlador em operação no município não é informação divulgada, circunstância que a literatura sobre parcerias público-privadas de iluminação registra como característica do setor, e não como exceção.</w:t>
+        <w:t xml:space="preserve">Duas delimitações fecham a subseção. A primeira é que a correspondência aqui estabelecida é funcional e topológica — um serviço central decide, o ponto de luz executa e reporta —, e não de escala, de potência, de geometria fotométrica, de instrumentação nem de enlace; essas divergências figuram entre as limitações e nenhuma delas incide sobre a camada avaliada. A segunda é que os autores não tiveram acesso ao equipamento efetivamente instalado pela concessionária: a cadeia descrita apoia-se no que o contrato exige desse equipamento e no que a normalização brasileira impõe a ele — </w:t>
+      </w:r>
+      <w:del w:id="30034" w:author="Vitor Oliveira" w:date="2026-09-28T12:00:00Z">
+        <w:r>
+          <w:rPr>
+            <w:lang w:val="pt-BR"/>
+          </w:rPr>
+          <w:delText xml:space="preserve">a tomada normalizada do relé fotocontrolador (ASSOCIAÇÃO BRASILEIRA DE NORMAS TÉCNICAS, 2016)</w:delText>
+        </w:r>
+      </w:del>
+      <w:ins w:id="30035" w:author="Vitor Oliveira" w:date="2026-09-28T12:00:00Z">
+        <w:r>
+          <w:rPr>
+            <w:lang w:val="pt-BR"/>
+          </w:rPr>
+          <w:t xml:space="preserve">a tomada da luminária, de sete contatos no padrão ANSI C136.41 (AMERICAN NATIONAL STANDARDS INSTITUTE, 2013), que acrescenta contatos de dimerização à tomada do relé fotocontrolador normalizada pela ABNT NBR 5123 (ASSOCIAÇÃO BRASILEIRA DE NORMAS TÉCNICAS, 2016)</w:t>
+        </w:r>
+      </w:ins>
+      <w:r>
+        <w:rPr>
+          <w:lang w:val="pt-BR"/>
+        </w:rPr>
+        <w:t xml:space="preserve">, a certificação compulsória da luminária viária (INSTITUTO NACIONAL DE METROLOGIA, QUALIDADE E TECNOLOGIA, 2022a) e a regulamentação metrológica da medição de energia no ponto de luz (INSTITUTO NACIONAL DE METROLOGIA, QUALIDADE E TECNOLOGIA, 2022b) —, todos documentos públicos, e não em sua inspeção. O modelo do controlador em operação no município não é informação divulgada, circunstância que a literatura sobre parcerias público-privadas de iluminação registra como característica do setor, e não como exceção.</w:t>
       </w:r>
     </w:p>
     <w:p>
@@ -11311,6 +11707,23 @@
     </w:p>
     <w:p>
       <w:pPr>
+        <w:pStyle w:val="Heading3"/>
+        <w:spacing w:before="320" w:after="200" w:line="360" w:lineRule="auto"/>
+        <w:rPr>
+          <w:ins w:id="30036" w:author="Vitor Oliveira" w:date="2026-09-28T12:00:00Z"/>
+        </w:rPr>
+      </w:pPr>
+      <w:ins w:id="30037" w:author="Vitor Oliveira" w:date="2026-09-28T12:00:00Z">
+        <w:r>
+          <w:rPr>
+            <w:lang w:val="pt-BR"/>
+          </w:rPr>
+          <w:t xml:space="preserve">3.5.1 Conjuntos de dados e suíte de cenários</w:t>
+        </w:r>
+      </w:ins>
+    </w:p>
+    <w:p>
+      <w:pPr>
         <w:spacing w:after="120" w:line="360" w:lineRule="auto"/>
         <w:ind w:firstLine="709"/>
         <w:jc w:val="both"/>
@@ -11338,7 +11751,29 @@
         <w:rPr>
           <w:lang w:val="pt-BR"/>
         </w:rPr>
-        <w:t xml:space="preserve">Dois conjuntos sustentam essa construção. As solicitações registradas pelos canais do SP156, disponibilizadas no portal municipal de dados abertos (SÃO PAULO, 2026), fornecem a distribuição de demandas por serviço urbano, entre elas as relativas à iluminação pública, permitindo caracterizar regiões e horários de maior incidência. A base georreferenciada municipal fornece a caracterização das vias que permite determinar a classe de iluminação aplicável.</w:t>
+        <w:t xml:space="preserve">Dois conjuntos sustentam essa construção. As solicitações registradas pelos canais do SP156, disponibilizadas no portal municipal de dados abertos </w:t>
+      </w:r>
+      <w:del w:id="30038" w:author="Vitor Oliveira" w:date="2026-09-28T12:00:00Z">
+        <w:r>
+          <w:rPr>
+            <w:lang w:val="pt-BR"/>
+          </w:rPr>
+          <w:delText xml:space="preserve">(SÃO PAULO, 2026)</w:delText>
+        </w:r>
+      </w:del>
+      <w:ins w:id="30039" w:author="Vitor Oliveira" w:date="2026-09-28T12:00:00Z">
+        <w:r>
+          <w:rPr>
+            <w:lang w:val="pt-BR"/>
+          </w:rPr>
+          <w:t xml:space="preserve">(SÃO PAULO, 2026a)</w:t>
+        </w:r>
+      </w:ins>
+      <w:r>
+        <w:rPr>
+          <w:lang w:val="pt-BR"/>
+        </w:rPr>
+        <w:t xml:space="preserve">, fornecem a distribuição de demandas por serviço urbano, entre elas as relativas à iluminação pública, permitindo caracterizar regiões e horários de maior incidência. A base georreferenciada municipal fornece a caracterização das vias que permite determinar a classe de iluminação aplicável.</w:t>
       </w:r>
     </w:p>
     <w:p>
@@ -11386,7 +11821,29 @@
         <w:rPr>
           <w:lang w:val="pt-BR"/>
         </w:rPr>
-        <w:t>Da análise desses conjuntos deriva-se a suíte de cenários de avaliação, composta por situações que cobrem o espaço de entrada do sistema, incluídas as combinações conflitantes — movimentação baixa com ocorrência reportada, horário avançado com fluxo intenso — que constituem o caso interessante da decisão.</w:t>
+        <w:t xml:space="preserve">Da análise desses conjuntos deriva-se a suíte de cenários de avaliação, composta por situações que cobrem o espaço de entrada do sistema, incluídas as combinações conflitantes — </w:t>
+      </w:r>
+      <w:del w:id="30040" w:author="Vitor Oliveira" w:date="2026-09-28T12:00:00Z">
+        <w:r>
+          <w:rPr>
+            <w:lang w:val="pt-BR"/>
+          </w:rPr>
+          <w:delText xml:space="preserve">movimentação baixa com ocorrência reportada, horário avançado com fluxo intenso</w:delText>
+        </w:r>
+      </w:del>
+      <w:ins w:id="30041" w:author="Vitor Oliveira" w:date="2026-09-28T12:00:00Z">
+        <w:r>
+          <w:rPr>
+            <w:lang w:val="pt-BR"/>
+          </w:rPr>
+          <w:t xml:space="preserve">via vazia com ocorrência reportada, madrugada com pedestres na via</w:t>
+        </w:r>
+      </w:ins>
+      <w:r>
+        <w:rPr>
+          <w:lang w:val="pt-BR"/>
+        </w:rPr>
+        <w:t xml:space="preserve"> — que constituem o caso interessante da decisão.</w:t>
       </w:r>
     </w:p>
     <w:p>
@@ -11399,8 +11856,159 @@
         <w:rPr>
           <w:lang w:val="pt-BR"/>
         </w:rPr>
-        <w:t xml:space="preserve">Completam a suíte cenários adversariais, construídos para induzir a violação — movimentação alternando entre vazio e cheio a cada minuto, movimentação nula declarada e interrupção da publicação pela plataforma —, e um cenário de ruído na fronteira, em que a movimentação oscila em torno do tercil inferior. Este último foi acrescentado depois da primeira comparação entre a inferência nebulosa e uma tabela em degraus, descrita em 3.9, para exercitar a região em que as duas diferem, que nenhum cenário anterior alcançava. O envelope esperado de cada cenário foi fixado antes de sua execução.</w:t>
-      </w:r>
+        <w:t xml:space="preserve">Completam a suíte cenários adversariais, construídos para induzir a violação — </w:t>
+      </w:r>
+      <w:del w:id="30042" w:author="Vitor Oliveira" w:date="2026-09-28T12:00:00Z">
+        <w:r>
+          <w:rPr>
+            <w:lang w:val="pt-BR"/>
+          </w:rPr>
+          <w:delText xml:space="preserve">movimentação alternando entre vazio e cheio a cada minuto, movimentação nula declarada</w:delText>
+        </w:r>
+      </w:del>
+      <w:ins w:id="30043" w:author="Vitor Oliveira" w:date="2026-09-28T12:00:00Z">
+        <w:r>
+          <w:rPr>
+            <w:lang w:val="pt-BR"/>
+          </w:rPr>
+          <w:t xml:space="preserve">via alternando entre vazia e ocupada a cada minuto, via vazia declarada</w:t>
+        </w:r>
+      </w:ins>
+      <w:r>
+        <w:rPr>
+          <w:lang w:val="pt-BR"/>
+        </w:rPr>
+        <w:t xml:space="preserve"> e interrupção da publicação pela plataforma —, </w:t>
+      </w:r>
+      <w:del w:id="30044" w:author="Vitor Oliveira" w:date="2026-09-28T12:00:00Z">
+        <w:r>
+          <w:rPr>
+            <w:lang w:val="pt-BR"/>
+          </w:rPr>
+          <w:delText xml:space="preserve">e um cenário de ruído na fronteira, em que a movimentação oscila em torno do tercil inferior. Este último foi acrescentado depois da primeira comparação entre a inferência nebulosa e uma tabela em degraus, descrita em 3.9, para exercitar a região em que as duas diferem, que nenhum cenário anterior alcançava.</w:delText>
+        </w:r>
+      </w:del>
+      <w:ins w:id="30045" w:author="Vitor Oliveira" w:date="2026-09-28T12:00:00Z">
+        <w:r>
+          <w:rPr>
+            <w:lang w:val="pt-BR"/>
+          </w:rPr>
+          <w:t xml:space="preserve">e um cenário de presença intermitente, em que um pedestre ocasional atravessa a via de madrugada. Este último substitui um cenário de ruído na fronteira do tercil inferior, acrescentado depois da primeira comparação entre a inferência nebulosa e uma tabela em degraus (3.9) e que perdeu objeto quando a observação passou a ser a presença, grandeza binária (3.5.2 e 3.7).</w:t>
+        </w:r>
+      </w:ins>
+      <w:r>
+        <w:rPr>
+          <w:lang w:val="pt-BR"/>
+        </w:rPr>
+        <w:t xml:space="preserve"> O envelope esperado de cada cenário foi fixado antes de sua execução.</w:t>
+      </w:r>
+    </w:p>
+    <w:p>
+      <w:pPr>
+        <w:pStyle w:val="Heading3"/>
+        <w:spacing w:before="320" w:after="200" w:line="360" w:lineRule="auto"/>
+        <w:rPr>
+          <w:ins w:id="30046" w:author="Vitor Oliveira" w:date="2026-09-28T12:00:00Z"/>
+        </w:rPr>
+      </w:pPr>
+      <w:ins w:id="30047" w:author="Vitor Oliveira" w:date="2026-09-28T12:00:00Z">
+        <w:r>
+          <w:rPr>
+            <w:lang w:val="pt-BR"/>
+          </w:rPr>
+          <w:t xml:space="preserve">3.5.2 Leitura do trecho e identificação espacial</w:t>
+        </w:r>
+      </w:ins>
+    </w:p>
+    <w:p>
+      <w:pPr>
+        <w:spacing w:after="120" w:line="360" w:lineRule="auto"/>
+        <w:ind w:firstLine="709"/>
+        <w:jc w:val="both"/>
+        <w:rPr>
+          <w:ins w:id="30048" w:author="Vitor Oliveira" w:date="2026-09-28T12:00:00Z"/>
+        </w:rPr>
+      </w:pPr>
+      <w:ins w:id="30049" w:author="Vitor Oliveira" w:date="2026-09-28T12:00:00Z">
+        <w:r>
+          <w:rPr>
+            <w:lang w:val="pt-BR"/>
+          </w:rPr>
+          <w:t xml:space="preserve">A interface precisa dizer não apenas o que ocorre, mas onde. Com um único ponto de luz, todo evento valeria para ele; com mais de um, é preciso saber qual câmera observa a via que qual luminária ilumina. A plataforma publica, por isso, a leitura de um trecho de via: quantas pessoas há na área do trecho naquele instante, se há ocorrência de segurança ou de trânsito e qual é o trecho. A leitura é renovada a cada poucos segundos e vale por um minuto; vencida sem renovação, o serviço decide o nível pleno (3.7). A plataforma entrega contagem, e não nível normalizado: quem conhece a via é o serviço de decisão, e a contagem de pessoas por área é exatamente o analítico que o termo de referência da plataforma já exige (2.3).</w:t>
+        </w:r>
+      </w:ins>
+    </w:p>
+    <w:p>
+      <w:pPr>
+        <w:spacing w:after="120" w:line="360" w:lineRule="auto"/>
+        <w:ind w:firstLine="709"/>
+        <w:jc w:val="both"/>
+        <w:rPr>
+          <w:ins w:id="30050" w:author="Vitor Oliveira" w:date="2026-09-28T12:00:00Z"/>
+        </w:rPr>
+      </w:pPr>
+      <w:ins w:id="30051" w:author="Vitor Oliveira" w:date="2026-09-28T12:00:00Z">
+        <w:r>
+          <w:rPr>
+            <w:lang w:val="pt-BR"/>
+          </w:rPr>
+          <w:t xml:space="preserve">As duas pontas da cadeia já são georreferenciadas. As câmeras do Smart Sampa são cadastradas com latitude, longitude, endereço, distrito e subprefeitura (SÃO PAULO, 2024). O Caderno de Encargos exige o cadastro técnico georreferenciado do parque, com posição e código cadastral de cada ponto de luz, integrado à base cartográfica do município, e é por esse cadastro que a telegestão atua sobre cada ponto (SÃO PAULO, 2015, itens 13, 13.1 e 13.3). O cadastro é público: o GeoSampa, portal cartográfico municipal, publica 662.945 pontos de iluminação, cada um com placa e coordenadas, e 218.768 segmentos de logradouro, cada um com o código oficial do logradouro e sua geometria (SÃO PAULO, 2026c). O que falta é a regra que liga um lugar observado a um ponto de luz.</w:t>
+        </w:r>
+      </w:ins>
+    </w:p>
+    <w:p>
+      <w:pPr>
+        <w:spacing w:after="120" w:line="360" w:lineRule="auto"/>
+        <w:ind w:firstLine="709"/>
+        <w:jc w:val="both"/>
+        <w:rPr>
+          <w:ins w:id="30052" w:author="Vitor Oliveira" w:date="2026-09-28T12:00:00Z"/>
+        </w:rPr>
+      </w:pPr>
+      <w:ins w:id="30053" w:author="Vitor Oliveira" w:date="2026-09-28T12:00:00Z">
+        <w:r>
+          <w:rPr>
+            <w:lang w:val="pt-BR"/>
+          </w:rPr>
+          <w:t xml:space="preserve">Adota-se como unidade espacial o segmento de logradouro do GeoSampa, identificado pelo código do próprio cadastro. Cada ponto de luz associa-se a todo trecho cuja linha passe a até 25 m de sua posição, distância medida no sistema de coordenadas plano da base cartográfica. A relação é de muitos para muitos: um poste de esquina ilumina mais de um trecho, e um trecho é iluminado por vários postes. A decisão de cada ponto considera todos os trechos associados a ele, pelo lado seguro — há presença se houver alguém em qualquer trecho, e ocorrência se qualquer trecho a reportar. Cada leitura refere-se a um único trecho, e o raio e o critério da associação são gravados junto com ela, de modo que a regra seja reconstituível e ajustável por operação sobre dado.</w:t>
+        </w:r>
+      </w:ins>
+    </w:p>
+    <w:p>
+      <w:pPr>
+        <w:spacing w:after="120" w:line="360" w:lineRule="auto"/>
+        <w:ind w:firstLine="709"/>
+        <w:jc w:val="both"/>
+        <w:rPr>
+          <w:ins w:id="30054" w:author="Vitor Oliveira" w:date="2026-09-28T12:00:00Z"/>
+        </w:rPr>
+      </w:pPr>
+      <w:ins w:id="30055" w:author="Vitor Oliveira" w:date="2026-09-28T12:00:00Z">
+        <w:r>
+          <w:rPr>
+            <w:lang w:val="pt-BR"/>
+          </w:rPr>
+          <w:t xml:space="preserve">A associação foi construída sobre dado real. Recortou-se do GeoSampa um quarteirão do Jardim Helena, na zona leste, com 16 trechos e 36 postes. O nó de bancada representa um desses postes, próximo de uma esquina e associado a três trechos, e um segundo ponto, simulado, representa um poste de meio de quadra, associado a um único trecho. Dois achados decorrem do dado. O primeiro é que os segmentos do cadastro são curtos, de 30 m a 100 m, e com o raio adotado 17 dos 36 postes caem em três ou mais trechos, o que é conservador para a segurança e reduz a atenuação. O segundo é que o cadastro tem ruído — placa duplicada, poste a mais de 25 m de qualquer trecho, endereço em texto livre —, e por isso a associação é geométrica, e não por nome de rua.</w:t>
+        </w:r>
+      </w:ins>
+    </w:p>
+    <w:p>
+      <w:pPr>
+        <w:spacing w:after="120" w:line="360" w:lineRule="auto"/>
+        <w:ind w:firstLine="709"/>
+        <w:jc w:val="both"/>
+        <w:rPr>
+          <w:ins w:id="30056" w:author="Vitor Oliveira" w:date="2026-09-28T12:00:00Z"/>
+        </w:rPr>
+      </w:pPr>
+      <w:ins w:id="30057" w:author="Vitor Oliveira" w:date="2026-09-28T12:00:00Z">
+        <w:r>
+          <w:rPr>
+            <w:lang w:val="pt-BR"/>
+          </w:rPr>
+          <w:t xml:space="preserve">Na implantação, o comando à luminária seria endereçado pelo código cadastral do ponto no sistema de telegestão. Para essa ligação existe interface padronizada entre o sistema central de gestão e as redes de controladores de iluminação: o protocolo TALQ, cuja versão 2.7.1, de abril de 2026, é especificada como interface REST com cargas em JSON e prevê a localização de cada dispositivo e grupos para comando coletivo (TALQ CONSORTIUM, 2026). O MQTT é o meio da bancada; o que se transpõe é a semântica — ponto de luz, nível adimensional e identificador da decisão —, e não o transporte.</w:t>
+        </w:r>
+      </w:ins>
     </w:p>
     <w:p>
       <w:pPr>
@@ -11495,6 +12103,24 @@
         </w:rPr>
         <w:t xml:space="preserve">Da extração de 23 de setembro de 2026 foram retidos os 49 sensores com cobertura igual ou superior a 98 % no período. Os atributos do modelo são as contagens de uma, duas, três, vinte e quatro e cento e sessenta e oito horas antes, as médias das três e das vinte e quatro horas anteriores, a hora do dia, o dia da semana, o fim de semana e o feriado. No treino, os feriados são os de Victoria, onde a série é medida; em operação, os nacionais brasileiros — é o atributo que muda de calendário com a cidade, e não o modelo. Sem histórico suficiente para os atributos de atraso, o serviço recorre à persistência em vez de extrapolar sobre a lacuna.</w:t>
       </w:r>
+    </w:p>
+    <w:p>
+      <w:pPr>
+        <w:spacing w:after="120" w:line="360" w:lineRule="auto"/>
+        <w:ind w:firstLine="709"/>
+        <w:jc w:val="both"/>
+        <w:rPr>
+          <w:ins w:id="30058" w:author="Vitor Oliveira" w:date="2026-09-28T12:00:00Z"/>
+        </w:rPr>
+      </w:pPr>
+      <w:ins w:id="30059" w:author="Vitor Oliveira" w:date="2026-09-28T12:00:00Z">
+        <w:r>
+          <w:rPr>
+            <w:lang w:val="pt-BR"/>
+          </w:rPr>
+          <w:t xml:space="preserve">Em operação, a série não chega pronta: o serviço a constrói a partir das leituras de cada trecho (3.5.2), como média horária do número de pessoas, dividida por uma referência do trecho — o percentil 99 das médias horárias dos últimos 28 dias, o mesmo critério do treino, calculado quando há ao menos 168 horas de leitura; até lá, um valor inicial declarado de cinco pessoas. Para um ponto de luz associado a vários trechos, prevalece o maior nível normalizado entre eles, pelo mesmo lado seguro. O arranque com referência arbitrada é limitação declarada em 6.3.</w:t>
+        </w:r>
+      </w:ins>
     </w:p>
     <w:p>
       <w:pPr>
@@ -11659,14 +12285,26 @@
                 <w:lang w:val="pt-BR"/>
               </w:rPr>
             </w:pPr>
-            <w:r>
-              <w:rPr>
-                <w:sz w:val="20"/>
-                <w:szCs w:val="20"/>
-                <w:lang w:val="pt-BR"/>
-              </w:rPr>
-              <w:t>Nível de movimentação na via</w:t>
-            </w:r>
+            <w:del w:id="30060" w:author="Vitor Oliveira" w:date="2026-09-28T12:00:00Z">
+              <w:r>
+                <w:rPr>
+                  <w:sz w:val="20"/>
+                  <w:szCs w:val="20"/>
+                  <w:lang w:val="pt-BR"/>
+                </w:rPr>
+                <w:delText>Nível de movimentação na via</w:delText>
+              </w:r>
+            </w:del>
+            <w:ins w:id="30061" w:author="Vitor Oliveira" w:date="2026-09-28T12:00:00Z">
+              <w:r>
+                <w:rPr>
+                  <w:sz w:val="20"/>
+                  <w:szCs w:val="20"/>
+                  <w:lang w:val="pt-BR"/>
+                </w:rPr>
+                <w:t xml:space="preserve">Presença de pedestres no trecho</w:t>
+              </w:r>
+            </w:ins>
           </w:p>
         </w:tc>
         <w:tc>
@@ -11705,14 +12343,26 @@
                 <w:lang w:val="pt-BR"/>
               </w:rPr>
             </w:pPr>
-            <w:r>
-              <w:rPr>
-                <w:sz w:val="20"/>
-                <w:szCs w:val="20"/>
-                <w:lang w:val="pt-BR"/>
-              </w:rPr>
-              <w:t xml:space="preserve">É a variável que a norma indica como determinante do tempo de funcionamento da iluminação adaptativa, na subseção 6.10.3. No cenário adotado, de classe P, corresponde à atividade de pedestres, obtida da contagem e da detecção de densidade de pessoas já exigidas da plataforma municipal (2.3); em vias de classe M, a mesma variável seria alimentada pelo fluxo de veículos</w:t>
-            </w:r>
+            <w:del w:id="30062" w:author="Vitor Oliveira" w:date="2026-09-28T12:00:00Z">
+              <w:r>
+                <w:rPr>
+                  <w:sz w:val="20"/>
+                  <w:szCs w:val="20"/>
+                  <w:lang w:val="pt-BR"/>
+                </w:rPr>
+                <w:delText xml:space="preserve">É a variável que a norma indica como determinante do tempo de funcionamento da iluminação adaptativa, na subseção 6.10.3. No cenário adotado, de classe P, corresponde à atividade de pedestres, obtida da contagem e da detecção de densidade de pessoas já exigidas da plataforma municipal (2.3); em vias de classe M, a mesma variável seria alimentada pelo fluxo de veículos</w:delText>
+              </w:r>
+            </w:del>
+            <w:ins w:id="30063" w:author="Vitor Oliveira" w:date="2026-09-28T12:00:00Z">
+              <w:r>
+                <w:rPr>
+                  <w:sz w:val="20"/>
+                  <w:szCs w:val="20"/>
+                  <w:lang w:val="pt-BR"/>
+                </w:rPr>
+                <w:t xml:space="preserve">Há ou não pessoas na área do trecho, segundo a contagem já exigida da plataforma municipal (2.3). Havendo, não se atenua: a ABNT NBR 5101 fixa a iluminância vertical das classes P para o reconhecimento facial e a reação do pedestre (1.6), e com alguém na via a luz existe para ele. Presença, e não volume, porque a condição vale igualmente em qualquer via, sem normalização; em vias de classe M, a mesma variável seria alimentada pela presença de veículos</w:t>
+              </w:r>
+            </w:ins>
           </w:p>
         </w:tc>
       </w:tr>
@@ -11754,13 +12404,24 @@
             </w:tcMar>
           </w:tcPr>
           <w:p>
-            <w:r>
-              <w:rPr>
-                <w:sz w:val="20"/>
-                <w:szCs w:val="20"/>
-              </w:rPr>
-              <w:t>Camada de previsão (3.6)</w:t>
-            </w:r>
+            <w:del w:id="30064" w:author="Vitor Oliveira" w:date="2026-09-28T12:00:00Z">
+              <w:r>
+                <w:rPr>
+                  <w:sz w:val="20"/>
+                  <w:szCs w:val="20"/>
+                </w:rPr>
+                <w:delText>Camada de previsão (3.6)</w:delText>
+              </w:r>
+            </w:del>
+            <w:ins w:id="30065" w:author="Vitor Oliveira" w:date="2026-09-28T12:00:00Z">
+              <w:r>
+                <w:rPr>
+                  <w:sz w:val="20"/>
+                  <w:szCs w:val="20"/>
+                </w:rPr>
+                <w:t xml:space="preserve">Camada de previsão, sobre o histórico de leituras do trecho (3.6)</w:t>
+              </w:r>
+            </w:ins>
           </w:p>
         </w:tc>
         <w:tc>
@@ -11802,13 +12463,24 @@
             </w:tcMar>
           </w:tcPr>
           <w:p>
-            <w:r>
-              <w:rPr>
-                <w:sz w:val="20"/>
-                <w:szCs w:val="20"/>
-              </w:rPr>
-              <w:t>Ocorrência reportada nas proximidades</w:t>
-            </w:r>
+            <w:del w:id="30066" w:author="Vitor Oliveira" w:date="2026-09-28T12:00:00Z">
+              <w:r>
+                <w:rPr>
+                  <w:sz w:val="20"/>
+                  <w:szCs w:val="20"/>
+                </w:rPr>
+                <w:delText>Ocorrência reportada nas proximidades</w:delText>
+              </w:r>
+            </w:del>
+            <w:ins w:id="30067" w:author="Vitor Oliveira" w:date="2026-09-28T12:00:00Z">
+              <w:r>
+                <w:rPr>
+                  <w:sz w:val="20"/>
+                  <w:szCs w:val="20"/>
+                </w:rPr>
+                <w:t xml:space="preserve">Ocorrência reportada no trecho</w:t>
+              </w:r>
+            </w:ins>
           </w:p>
         </w:tc>
         <w:tc>
@@ -12036,7 +12708,51 @@
         <w:rPr>
           <w:lang w:val="pt-BR"/>
         </w:rPr>
-        <w:t xml:space="preserve">Definidas as variáveis, restam as partições — os conjuntos linguísticos em que o universo de discurso de cada variável contínua é dividido. As variáveis de movimentação, a observada e a prevista, são particionadas em baixa, média e alta, e as fronteiras entre esses conjuntos são fixadas nos tercis da distribuição observada na série adotada, normalizada por ponto de medição. Na série adotada, as fronteiras resultam em 0,104 e 0,405 do nível normalizado, valores assimétricos que refletem a predominância de horas de baixa circulação. O critério não é arbitrado pelos autores: é valor derivado do dado, reproduzível por qualquer leitor que aplique o mesmo procedimento à mesma série. É também coerente com a normalização declarada em 3.6 — calculados por ponto de medição, os tercis acompanham o patamar local de circulação, e o que se transfere da série de Melbourne continua sendo a estrutura da distribuição, e não o valor absoluto de contagem. As demais variáveis não demandam esse tratamento: ocorrência reportada é categórica, a faixa horária é fixada pelo relógio e a classe de iluminação é atributo do ponto de luz.</w:t>
+        <w:t xml:space="preserve">Definidas as variáveis, restam as partições — os conjuntos linguísticos em que o universo de discurso de cada variável contínua é dividido. </w:t>
+      </w:r>
+      <w:del w:id="30068" w:author="Vitor Oliveira" w:date="2026-09-28T12:00:00Z">
+        <w:r>
+          <w:rPr>
+            <w:lang w:val="pt-BR"/>
+          </w:rPr>
+          <w:delText xml:space="preserve">As variáveis de movimentação, a observada e a prevista, são particionadas em baixa, média e alta</w:delText>
+        </w:r>
+      </w:del>
+      <w:ins w:id="30069" w:author="Vitor Oliveira" w:date="2026-09-28T12:00:00Z">
+        <w:r>
+          <w:rPr>
+            <w:lang w:val="pt-BR"/>
+          </w:rPr>
+          <w:t xml:space="preserve">A movimentação prevista é particionada em baixa, média e alta</w:t>
+        </w:r>
+      </w:ins>
+      <w:r>
+        <w:rPr>
+          <w:lang w:val="pt-BR"/>
+        </w:rPr>
+        <w:t xml:space="preserve">, e as fronteiras entre esses conjuntos são fixadas nos tercis da distribuição observada na série adotada, normalizada por ponto de medição. Na série adotada, as fronteiras resultam em 0,104 e 0,405 do nível normalizado, valores assimétricos que refletem a predominância de horas de baixa circulação. O critério não é arbitrado pelos autores: é valor derivado do dado, reproduzível por qualquer leitor que aplique o mesmo procedimento à mesma série. É também coerente com a normalização declarada em 3.6 — calculados por ponto de medição, os tercis acompanham o patamar local de circulação, e o que se transfere da série de Melbourne continua sendo a estrutura da distribuição, e não o valor absoluto de contagem. As demais variáveis não demandam esse tratamento: </w:t>
+      </w:r>
+      <w:del w:id="30070" w:author="Vitor Oliveira" w:date="2026-09-28T12:00:00Z">
+        <w:r>
+          <w:rPr>
+            <w:lang w:val="pt-BR"/>
+          </w:rPr>
+          <w:delText xml:space="preserve">ocorrência reportada é categórica,</w:delText>
+        </w:r>
+      </w:del>
+      <w:ins w:id="30071" w:author="Vitor Oliveira" w:date="2026-09-28T12:00:00Z">
+        <w:r>
+          <w:rPr>
+            <w:lang w:val="pt-BR"/>
+          </w:rPr>
+          <w:t xml:space="preserve">presença e ocorrência reportada são categóricas,</w:t>
+        </w:r>
+      </w:ins>
+      <w:r>
+        <w:rPr>
+          <w:lang w:val="pt-BR"/>
+        </w:rPr>
+        <w:t xml:space="preserve"> a faixa horária é fixada pelo relógio e a classe de iluminação é atributo do ponto de luz.</w:t>
       </w:r>
     </w:p>
     <w:p>
@@ -12097,8 +12813,60 @@
         <w:rPr>
           <w:lang w:val="pt-BR"/>
         </w:rPr>
-        <w:t>O método é o de Mamdani na forma usual: conjunção e implicação pelo mínimo, agregação pelo máximo e defuzificação pelo centroide (MAMDANI; ASSILIAN, 1975). A base vigente tem oito regras. As que elevam o nível tratam da ocorrência reportada e da movimentação, observada ou prevista, alta ou média; as que atenuam abaixo do pleno são todas condicionadas à ausência de ocorrência, de modo que a evidência de risco não seja diluída na agregação por uma regra de redução ativa ao mesmo tempo — restrição deliberada de interpretabilidade, na linha de Pickering, Cohen e De Baets (2026). A faixa horária é medida em horas desde as 18 h e dividida em início da noite, madrugada e pré-amanhecer. Se nenhuma regra for ativada, o nível pretendido é o pleno; a varredura do espaço de entrada mostra que isso não ocorre com a base vigente. Qualquer alteração da base gera nova versão, identificada pelo conteúdo do arquivo, e cada decisão registra a versão que a produziu.</w:t>
-      </w:r>
+        <w:t xml:space="preserve">O método é o de Mamdani na forma usual: conjunção e implicação pelo mínimo, agregação pelo máximo e defuzificação pelo centroide (MAMDANI; ASSILIAN, 1975). </w:t>
+      </w:r>
+      <w:del w:id="30072" w:author="Vitor Oliveira" w:date="2026-09-28T12:00:00Z">
+        <w:r>
+          <w:rPr>
+            <w:lang w:val="pt-BR"/>
+          </w:rPr>
+          <w:delText xml:space="preserve">A base vigente tem oito regras. As que elevam o nível tratam da ocorrência reportada e da movimentação, observada ou prevista, alta ou média; as que atenuam abaixo do pleno são todas condicionadas à ausência de ocorrência, de modo que a evidência de risco não seja diluída na agregação por uma regra de redução ativa ao mesmo tempo</w:delText>
+        </w:r>
+      </w:del>
+      <w:ins w:id="30073" w:author="Vitor Oliveira" w:date="2026-09-28T12:00:00Z">
+        <w:r>
+          <w:rPr>
+            <w:lang w:val="pt-BR"/>
+          </w:rPr>
+          <w:t xml:space="preserve">A base vigente tem seis regras. Três elevam ao pleno: a ocorrência reportada; a presença de pedestre no trecho, pela prescrição de reconhecimento facial das classes P; e a movimentação prevista alta, por antecipação. Três atenuam, e todas exigem via vazia e ausência de ocorrência: a previsão baixa conduz ao nível reduzido, a previsão média ao intermediário, e o início da noite ao intermediário, como evidência de apoio. Nenhuma regra reduz a luz com a via ocupada — a norma pede classe mais alta, e não mais baixa, quando cresce a atividade de pedestres (2.5) —, e a evidência de risco ou de pedestre não é diluída na agregação por uma regra de redução ativa ao mesmo tempo</w:t>
+        </w:r>
+      </w:ins>
+      <w:r>
+        <w:rPr>
+          <w:lang w:val="pt-BR"/>
+        </w:rPr>
+        <w:t xml:space="preserve"> — restrição deliberada de interpretabilidade, na linha de Pickering, Cohen e De Baets (2026). A faixa horária é medida em horas desde as 18 h e dividida em início da noite, madrugada e pré-amanhecer. Se nenhuma regra for ativada, o nível pretendido é o pleno; </w:t>
+      </w:r>
+      <w:del w:id="30074" w:author="Vitor Oliveira" w:date="2026-09-28T12:00:00Z">
+        <w:r>
+          <w:rPr>
+            <w:lang w:val="pt-BR"/>
+          </w:rPr>
+          <w:delText xml:space="preserve">a varredura do espaço de entrada mostra que isso não ocorre com a base vigente.</w:delText>
+        </w:r>
+      </w:del>
+      <w:ins w:id="30075" w:author="Vitor Oliveira" w:date="2026-09-28T12:00:00Z">
+        <w:r>
+          <w:rPr>
+            <w:lang w:val="pt-BR"/>
+          </w:rPr>
+          <w:t xml:space="preserve">com a base vigente, isso ocorre apenas quando faltam a previsão e o histórico do trecho, porque falta de informação nunca produz atenuação.</w:t>
+        </w:r>
+      </w:ins>
+      <w:r>
+        <w:rPr>
+          <w:lang w:val="pt-BR"/>
+        </w:rPr>
+        <w:t xml:space="preserve"> Qualquer alteração da base gera nova versão, identificada pelo conteúdo do arquivo, e cada decisão registra a versão que a produziu.</w:t>
+      </w:r>
+      <w:ins w:id="30076" w:author="Vitor Oliveira" w:date="2026-09-28T12:00:00Z">
+        <w:r>
+          <w:rPr>
+            <w:lang w:val="pt-BR"/>
+          </w:rPr>
+          <w:t xml:space="preserve"> A base vigente substitui uma versão de oito regras que tratava a movimentação observada como volume relativo, normalizado no ponto; a reformulação decorreu de a plataforma publicar contagem de pessoas, e não nível, e de a norma associar a iluminação de pedestres à presença de quem precisa ser reconhecido. Cada decisão grava ainda as entradas da inferência e o grau com que cada regra foi ativada, o que permite explicá-la regra a regra.</w:t>
+        </w:r>
+      </w:ins>
     </w:p>
     <w:p>
       <w:pPr>
@@ -12110,7 +12878,29 @@
         <w:rPr>
           <w:lang w:val="pt-BR"/>
         </w:rPr>
-        <w:t xml:space="preserve">A multiplicidade que justifica a inferência nebulosa é de variáveis, e não de classes: mesmo numa única classe, o sistema compõe movimentação observada, prevista e faixa horária, e trata a ocorrência reportada como condição que suspende a atenuação. A classe é parâmetro da camada de verificação. A extensão para vias de classe M, ou para pontos de luz que atendem pista e calçada, acrescenta uma segunda medida de demanda — o caso em que a composição de evidências parciais se torna ainda mais necessária — sem alterar o método.</w:t>
+        <w:t xml:space="preserve">A multiplicidade que justifica a inferência nebulosa é de variáveis, e não de classes: mesmo numa única classe, </w:t>
+      </w:r>
+      <w:del w:id="30077" w:author="Vitor Oliveira" w:date="2026-09-28T12:00:00Z">
+        <w:r>
+          <w:rPr>
+            <w:lang w:val="pt-BR"/>
+          </w:rPr>
+          <w:delText xml:space="preserve">o sistema compõe movimentação observada, prevista e faixa horária, e trata a ocorrência reportada como condição que suspende a atenuação.</w:delText>
+        </w:r>
+      </w:del>
+      <w:ins w:id="30078" w:author="Vitor Oliveira" w:date="2026-09-28T12:00:00Z">
+        <w:r>
+          <w:rPr>
+            <w:lang w:val="pt-BR"/>
+          </w:rPr>
+          <w:t xml:space="preserve">o sistema compõe movimentação prevista e faixa horária, e trata a presença de pedestre e a ocorrência reportada como condições que suspendem a atenuação.</w:t>
+        </w:r>
+      </w:ins>
+      <w:r>
+        <w:rPr>
+          <w:lang w:val="pt-BR"/>
+        </w:rPr>
+        <w:t xml:space="preserve"> A classe é parâmetro da camada de verificação. A extensão para vias de classe M, ou para pontos de luz que atendem pista e calçada, acrescenta uma segunda medida de demanda — o caso em que a composição de evidências parciais se torna ainda mais necessária — sem alterar o método.</w:t>
       </w:r>
     </w:p>
     <w:p>
@@ -12119,12 +12909,22 @@
         <w:ind w:firstLine="709"/>
         <w:jc w:val="both"/>
       </w:pPr>
-      <w:r>
-        <w:rPr>
-          <w:lang w:val="pt-BR"/>
-        </w:rPr>
-        <w:t>A escolha foi confrontada com a alternativa mais simples: a mesma base, com os mesmos tercis, operando como tabela em degraus, sem pertinência parcial. Na maior parte da suíte de cenários as duas empatam em segurança, aderência ao envelope e energia, porque as descidas bruscas da tabela são suavizadas pela camada de verificação. A diferença aparece quando a movimentação oscila em torno de uma fronteira: a tabela alterna entre degraus, e a inferência nebulosa permanece estável. A diferença é real, mas de pequena amplitude, e o trabalho não fundamenta a escolha em desempenho medido; fundamenta-a na legibilidade da base e na resposta gradual junto às fronteiras, com os números reportados no Capítulo 5.</w:t>
-      </w:r>
+      <w:del w:id="30079" w:author="Vitor Oliveira" w:date="2026-09-28T12:00:00Z">
+        <w:r>
+          <w:rPr>
+            <w:lang w:val="pt-BR"/>
+          </w:rPr>
+          <w:delText>A escolha foi confrontada com a alternativa mais simples: a mesma base, com os mesmos tercis, operando como tabela em degraus, sem pertinência parcial. Na maior parte da suíte de cenários as duas empatam em segurança, aderência ao envelope e energia, porque as descidas bruscas da tabela são suavizadas pela camada de verificação. A diferença aparece quando a movimentação oscila em torno de uma fronteira: a tabela alterna entre degraus, e a inferência nebulosa permanece estável. A diferença é real, mas de pequena amplitude, e o trabalho não fundamenta a escolha em desempenho medido; fundamenta-a na legibilidade da base e na resposta gradual junto às fronteiras, com os números reportados no Capítulo 5.</w:delText>
+        </w:r>
+      </w:del>
+      <w:ins w:id="30080" w:author="Vitor Oliveira" w:date="2026-09-28T12:00:00Z">
+        <w:r>
+          <w:rPr>
+            <w:lang w:val="pt-BR"/>
+          </w:rPr>
+          <w:t xml:space="preserve">A escolha foi confrontada com a alternativa mais simples: a mesma base, com os mesmos tercis, operando como tabela em degraus, sem pertinência parcial. Com a presença tratada como condição binária, a pertinência parcial atua apenas sobre a movimentação prevista e a faixa horária, e na suíte de cenários as duas empatam em segurança, aderência ao envelope e energia no modo antecipado. Na versão anterior da base, um cenário com a movimentação oscilando em torno de um tercil mostrou a tabela alternando entre degraus e a inferência nebulosa estável, com diferença de pequena amplitude; com a observação reduzida à presença, esse cenário perdeu objeto. O trabalho não fundamenta a escolha em desempenho medido; fundamenta-a na legibilidade da base e na resposta gradual junto às fronteiras da previsão, com os números reportados no Capítulo 5.</w:t>
+        </w:r>
+      </w:ins>
     </w:p>
     <w:p>
       <w:pPr>
@@ -12221,7 +13021,51 @@
         <w:rPr>
           <w:lang w:val="pt-BR"/>
         </w:rPr>
-        <w:t>A mesma lógica é estendida ao serviço. A movimentação publicada vale por quinze minutos; vencida sem renovação, o serviço decide o nível pleno e continua a publicar, de modo que a ausência de dado fica registrada como decisão, e não desaparece da auditoria. A ocorrência reportada vale até que a interface publique o seu encerramento: na dúvida, a condição de risco permanece. Falta de informação nunca produz atenuação.</w:t>
+        <w:t xml:space="preserve">A mesma lógica é estendida ao serviço. </w:t>
+      </w:r>
+      <w:del w:id="30081" w:author="Vitor Oliveira" w:date="2026-09-28T12:00:00Z">
+        <w:r>
+          <w:rPr>
+            <w:lang w:val="pt-BR"/>
+          </w:rPr>
+          <w:delText xml:space="preserve">A movimentação publicada vale por quinze minutos; vencida sem renovação,</w:delText>
+        </w:r>
+      </w:del>
+      <w:ins w:id="30082" w:author="Vitor Oliveira" w:date="2026-09-28T12:00:00Z">
+        <w:r>
+          <w:rPr>
+            <w:lang w:val="pt-BR"/>
+          </w:rPr>
+          <w:t xml:space="preserve">A leitura publicada vale por um minuto, e a plataforma a renova a cada poucos segundos; vencida sem renovação,</w:t>
+        </w:r>
+      </w:ins>
+      <w:r>
+        <w:rPr>
+          <w:lang w:val="pt-BR"/>
+        </w:rPr>
+        <w:t xml:space="preserve"> o serviço decide o nível pleno e continua a publicar, de modo que a ausência de dado fica registrada como decisão, e não desaparece da auditoria. </w:t>
+      </w:r>
+      <w:del w:id="30083" w:author="Vitor Oliveira" w:date="2026-09-28T12:00:00Z">
+        <w:r>
+          <w:rPr>
+            <w:lang w:val="pt-BR"/>
+          </w:rPr>
+          <w:delText xml:space="preserve">A ocorrência reportada vale até que a interface publique o seu encerramento: na dúvida, a condição de risco permanece.</w:delText>
+        </w:r>
+      </w:del>
+      <w:ins w:id="30084" w:author="Vitor Oliveira" w:date="2026-09-28T12:00:00Z">
+        <w:r>
+          <w:rPr>
+            <w:lang w:val="pt-BR"/>
+          </w:rPr>
+          <w:t xml:space="preserve">A ocorrência integra a leitura e vale enquanto a leitura que a reporta estiver vigente; em cada trecho, prevalece a leitura mais recente.</w:t>
+        </w:r>
+      </w:ins>
+      <w:r>
+        <w:rPr>
+          <w:lang w:val="pt-BR"/>
+        </w:rPr>
+        <w:t xml:space="preserve"> Falta de informação nunca produz atenuação.</w:t>
       </w:r>
     </w:p>
     <w:p>
@@ -12925,7 +13769,29 @@
         <w:rPr>
           <w:lang w:val="pt-BR"/>
         </w:rPr>
-        <w:t>Duas execuções complementares da suíte respondem a perguntas que as etapas acima não isolam. Na primeira, a suíte é repetida com a camada de previsão desligada — a inferência recebe a movimentação observada no lugar da prevista, com a mesma base de regras —, e compara-se a fração da janela de baixa demanda consumida em transição, métrica de H3 (2.10). Na segunda, a mesma base de regras opera como tabela em degraus, e comparam-se aderência ao envelope, energia e mudanças de nível, para verificar o que a pertinência parcial acrescenta (3.7).</w:t>
+        <w:t xml:space="preserve">Duas execuções complementares da suíte respondem a perguntas que as etapas acima não isolam. Na primeira, a suíte é repetida com a camada de previsão desligada — </w:t>
+      </w:r>
+      <w:del w:id="30085" w:author="Vitor Oliveira" w:date="2026-09-28T12:00:00Z">
+        <w:r>
+          <w:rPr>
+            <w:lang w:val="pt-BR"/>
+          </w:rPr>
+          <w:delText xml:space="preserve">a inferência recebe a movimentação observada no lugar da prevista, com a mesma base de regras —, e compara-se a fração da janela de baixa demanda consumida em transição, métrica de H3 (2.10).</w:delText>
+        </w:r>
+      </w:del>
+      <w:ins w:id="30086" w:author="Vitor Oliveira" w:date="2026-09-28T12:00:00Z">
+        <w:r>
+          <w:rPr>
+            <w:lang w:val="pt-BR"/>
+          </w:rPr>
+          <w:t xml:space="preserve">a inferência recebe o nível de movimentação da última hora, calculado das leituras do trecho, no lugar da previsão, com a mesma base de regras —, e compara-se a fração da janela de baixa demanda consumida em transição, métrica de H3 (2.10). A janela de baixa demanda é o conjunto de ciclos com a via vazia, leitura vigente e nenhuma ocorrência. Os ciclos em nível intermediário, que as regras de apoio produzem com a via vazia, contam como transição, o que pesa contra o modo antecipado, e a métrica é reportada com essa ressalva.</w:t>
+        </w:r>
+      </w:ins>
+      <w:r>
+        <w:rPr>
+          <w:lang w:val="pt-BR"/>
+        </w:rPr>
+        <w:t xml:space="preserve"> Na segunda, a mesma base de regras opera como tabela em degraus, e comparam-se aderência ao envelope, energia e mudanças de nível, para verificar o que a pertinência parcial acrescenta (3.7).</w:t>
       </w:r>
     </w:p>
     <w:p>
@@ -12943,6 +13809,24 @@
         </w:rPr>
         <w:t>Cabe explicitar a natureza do envelope de decisão esperado e a limitação que dele decorre. O envelope é o intervalo de níveis considerados aceitáveis para cada cenário, definido pelos autores antes da avaliação e derivado, sempre que possível, das prescrições normativas e da literatura. Onde essa derivação não é possível, o envelope reflete julgamento dos autores, e a avaliação mede, nesses casos, a coerência entre a base de regras e esse julgamento — não a correção da decisão em sentido absoluto. A declaração é necessária porque a alternativa, calar sobre a origem do envelope, apresentaria como validação externa aquilo que é, em parte, consistência interna.</w:t>
       </w:r>
+    </w:p>
+    <w:p>
+      <w:pPr>
+        <w:spacing w:after="120" w:line="360" w:lineRule="auto"/>
+        <w:ind w:firstLine="709"/>
+        <w:jc w:val="both"/>
+        <w:rPr>
+          <w:ins w:id="30087" w:author="Vitor Oliveira" w:date="2026-09-28T12:00:00Z"/>
+        </w:rPr>
+      </w:pPr>
+      <w:ins w:id="30088" w:author="Vitor Oliveira" w:date="2026-09-28T12:00:00Z">
+        <w:r>
+          <w:rPr>
+            <w:lang w:val="pt-BR"/>
+          </w:rPr>
+          <w:t xml:space="preserve">Com a base vigente, os envelopes decorrem dos conjuntos de saída — pleno com pedestre ou ocorrência, entre o piso e o intermediário com a via vazia, descida sob a rampa normativa nas transições — e são largos. A aderência verifica, por isso, coerência grosseira entre a decisão e a condição da via, e discrimina pouco entre regimes; é apresentada com essa ressalva.</w:t>
+        </w:r>
+      </w:ins>
     </w:p>
     <w:p>
       <w:pPr>
@@ -13010,8 +13894,24 @@
         <w:rPr>
           <w:lang w:val="pt-BR"/>
         </w:rPr>
-        <w:t xml:space="preserve">A interface de dados urbanos publica apenas descritores agregados do estado da via — nível de movimentação, ocorrência reportada —, sem referência a indivíduo.</w:t>
-      </w:r>
+        <w:t xml:space="preserve">A interface de dados urbanos publica apenas descritores agregados do estado da via — </w:t>
+      </w:r>
+      <w:del w:id="30089" w:author="Vitor Oliveira" w:date="2026-09-28T12:00:00Z">
+        <w:r>
+          <w:rPr>
+            <w:lang w:val="pt-BR"/>
+          </w:rPr>
+          <w:delText xml:space="preserve">nível de movimentação, ocorrência reportada —, sem referência a indivíduo.</w:delText>
+        </w:r>
+      </w:del>
+      <w:ins w:id="30090" w:author="Vitor Oliveira" w:date="2026-09-28T12:00:00Z">
+        <w:r>
+          <w:rPr>
+            <w:lang w:val="pt-BR"/>
+          </w:rPr>
+          <w:t xml:space="preserve">número de pessoas presentes no trecho, ocorrência reportada —, sem referência a indivíduo: contagem, e não identificação.</w:t>
+        </w:r>
+      </w:ins>
     </w:p>
     <w:p>
       <w:pPr>
@@ -13721,6 +14621,24 @@
         </w:rPr>
         <w:t xml:space="preserve">A comparação exige referência, e adotam-se duas. A primeira é o fluxo pleno constante ao longo de todo o período de operação, que corresponde ao regime hoje praticado no município, caracterizado em 2.3. A segunda é um regime de atenuação por horário fixo, que corresponde ao que um sistema de telegestão sem acesso a dados do ambiente pode fazer — e que é, precisamente, a programação agendada prevista no Caderno de Encargos da concessão. A segunda linha de base é a exigente, e é ela que dá sentido à pergunta de pesquisa: se a decisão informada por dados urbanos não se distinguisse de uma programação horária, a informação não estaria fazendo trabalho algum.</w:t>
       </w:r>
+    </w:p>
+    <w:p>
+      <w:pPr>
+        <w:spacing w:after="120" w:line="360" w:lineRule="auto"/>
+        <w:ind w:firstLine="709"/>
+        <w:jc w:val="both"/>
+        <w:rPr>
+          <w:ins w:id="30091" w:author="Vitor Oliveira" w:date="2026-09-28T12:00:00Z"/>
+        </w:rPr>
+      </w:pPr>
+      <w:ins w:id="30092" w:author="Vitor Oliveira" w:date="2026-09-28T12:00:00Z">
+        <w:r>
+          <w:rPr>
+            <w:lang w:val="pt-BR"/>
+          </w:rPr>
+          <w:t xml:space="preserve">Uma consequência da base vigente precisa ser declarada antes do resultado. A programação horária atenua às cegas, inclusive com a via ocupada; a decisão informada por dados urbanos não atenua havendo pedestre no trecho (3.7). Por isso, ela pode consumir mais que a segunda linha de base, e a comparação com ela é de aderência contra energia, e não de economia. É nesses termos que o resultado é reportado.</w:t>
+        </w:r>
+      </w:ins>
     </w:p>
     <w:p>
       <w:pPr>
@@ -16373,8 +17291,28 @@
                 <w:szCs w:val="20"/>
                 <w:lang w:val="pt-BR"/>
               </w:rPr>
-              <w:t xml:space="preserve">Sim. Painel web estático, publicado em serviço de hospedagem de front end, que consome a interface de programação e apresenta a cadeia completa de cada decisão</w:t>
-            </w:r>
+              <w:t xml:space="preserve">Sim. Painel web estático, publicado em serviço de hospedagem de front end, que consome a interface de programação </w:t>
+            </w:r>
+            <w:del w:id="30093" w:author="Vitor Oliveira" w:date="2026-09-28T12:00:00Z">
+              <w:r>
+                <w:rPr>
+                  <w:sz w:val="20"/>
+                  <w:szCs w:val="20"/>
+                  <w:lang w:val="pt-BR"/>
+                </w:rPr>
+                <w:delText xml:space="preserve">e apresenta a cadeia completa de cada decisão</w:delText>
+              </w:r>
+            </w:del>
+            <w:ins w:id="30094" w:author="Vitor Oliveira" w:date="2026-09-28T12:00:00Z">
+              <w:r>
+                <w:rPr>
+                  <w:sz w:val="20"/>
+                  <w:szCs w:val="20"/>
+                  <w:lang w:val="pt-BR"/>
+                </w:rPr>
+                <w:t xml:space="preserve">e apresenta a cadeia completa de cada decisão, com a explicação regra a regra; na demonstração, emula a publicação de leituras pela plataforma</w:t>
+              </w:r>
+            </w:ins>
           </w:p>
         </w:tc>
         <w:tc>
@@ -17345,14 +18283,26 @@
                 <w:lang w:val="pt-BR"/>
               </w:rPr>
             </w:pPr>
-            <w:r>
-              <w:rPr>
-                <w:sz w:val="20"/>
-                <w:szCs w:val="20"/>
-                <w:lang w:val="pt-BR"/>
-              </w:rPr>
-              <w:t>Exibir o dado recebido, o nível pretendido, a correção imposta e a iluminância medida</w:t>
-            </w:r>
+            <w:del w:id="30095" w:author="Vitor Oliveira" w:date="2026-09-28T12:00:00Z">
+              <w:r>
+                <w:rPr>
+                  <w:sz w:val="20"/>
+                  <w:szCs w:val="20"/>
+                  <w:lang w:val="pt-BR"/>
+                </w:rPr>
+                <w:delText>Exibir o dado recebido, o nível pretendido, a correção imposta e a iluminância medida</w:delText>
+              </w:r>
+            </w:del>
+            <w:ins w:id="30096" w:author="Vitor Oliveira" w:date="2026-09-28T12:00:00Z">
+              <w:r>
+                <w:rPr>
+                  <w:sz w:val="20"/>
+                  <w:szCs w:val="20"/>
+                  <w:lang w:val="pt-BR"/>
+                </w:rPr>
+                <w:t xml:space="preserve">Exibir o dado recebido, o nível pretendido, a correção imposta e a iluminância medida; explicar cada decisão pelas regras ativadas; na demonstração, publicar leituras de trecho em nome da plataforma emulada</w:t>
+              </w:r>
+            </w:ins>
           </w:p>
         </w:tc>
       </w:tr>
@@ -17595,6 +18545,14 @@
         </w:rPr>
         <w:t xml:space="preserve">Painel de acompanhamento. Aplicação web estática, publicada em serviço de hospedagem de front end e não na máquina virtual, que lê o histórico do banco pela interface REST e exibe, lado a lado, o dado recebido, o nível pretendido pela inferência, a correção eventualmente imposta pela camada de verificação e a iluminância medida. É a interface de apresentação do sistema e o que a plateia observa durante a defesa.</w:t>
       </w:r>
+      <w:ins w:id="30097" w:author="Vitor Oliveira" w:date="2026-09-28T12:00:00Z">
+        <w:r>
+          <w:rPr>
+            <w:lang w:val="pt-BR"/>
+          </w:rPr>
+          <w:t xml:space="preserve"> Para a demonstração, o painel oferece ainda um formulário que publica a leitura de um trecho como a plataforma a publicaria, com chave própria, distinta da chave de integração, e uma visão que explica cada decisão: as entradas, as regras que dispararam e o grau de cada uma, a correção imposta e a luz medida. O formulário emula a plataforma; a decisão continua no serviço.</w:t>
+        </w:r>
+      </w:ins>
     </w:p>
     <w:p>
       <w:pPr>
@@ -17611,6 +18569,14 @@
         </w:rPr>
         <w:t>Ao nó cabe assinar o tópico de comando, ajustar a modulação por largura de pulso e publicar a iluminância lida. A comunicação com o intermediário ocorre sobre canal cifrado, com credencial própria do dispositivo, de modo que a identidade de cada nó seja verificável no lado do serviço.</w:t>
       </w:r>
+      <w:ins w:id="30098" w:author="Vitor Oliveira" w:date="2026-09-28T12:00:00Z">
+        <w:r>
+          <w:rPr>
+            <w:lang w:val="pt-BR"/>
+          </w:rPr>
+          <w:t xml:space="preserve"> O canal é autenticado por certificado de autoridade certificadora própria, gravado no firmware, e uma regra de acesso vinculada à credencial faz com que cada nó só assine o próprio tópico de comando e só publique a própria telemetria. O serviço de decisão alcança o intermediário pela rede interna da máquina virtual, sem porta exposta, e o banco não é publicado. Na interface REST, a publicação de leituras exige chave de acesso; as consultas permanecem abertas, porque o painel apenas lê.</w:t>
+        </w:r>
+      </w:ins>
     </w:p>
     <w:p>
       <w:pPr>
@@ -17806,13 +18772,24 @@
             </w:tcMar>
           </w:tcPr>
           <w:p>
-            <w:r>
-              <w:rPr>
-                <w:sz w:val="20"/>
-                <w:szCs w:val="20"/>
-              </w:rPr>
-              <w:t>Publicação de evento urbano</w:t>
-            </w:r>
+            <w:del w:id="30099" w:author="Vitor Oliveira" w:date="2026-09-28T12:00:00Z">
+              <w:r>
+                <w:rPr>
+                  <w:sz w:val="20"/>
+                  <w:szCs w:val="20"/>
+                </w:rPr>
+                <w:delText>Publicação de evento urbano</w:delText>
+              </w:r>
+            </w:del>
+            <w:ins w:id="30100" w:author="Vitor Oliveira" w:date="2026-09-28T12:00:00Z">
+              <w:r>
+                <w:rPr>
+                  <w:sz w:val="20"/>
+                  <w:szCs w:val="20"/>
+                </w:rPr>
+                <w:t xml:space="preserve">Publicação da leitura de um trecho de via</w:t>
+              </w:r>
+            </w:ins>
           </w:p>
         </w:tc>
         <w:tc>
@@ -17831,14 +18808,26 @@
                 <w:lang w:val="pt-BR"/>
               </w:rPr>
             </w:pPr>
-            <w:r>
-              <w:rPr>
-                <w:sz w:val="20"/>
-                <w:szCs w:val="20"/>
-                <w:lang w:val="pt-BR"/>
-              </w:rPr>
-              <w:t>Carimbo de tempo com fuso horário; tipo do evento, movimentação ou ocorrência; valor de 0 a 1 para a movimentação, normalizado no ponto; rótulo para a ocorrência — segurança, trânsito ou encerrada; abrangência; origem; vigência opcional. Campo fora do contrato é recusado</w:t>
-            </w:r>
+            <w:del w:id="30101" w:author="Vitor Oliveira" w:date="2026-09-28T12:00:00Z">
+              <w:r>
+                <w:rPr>
+                  <w:sz w:val="20"/>
+                  <w:szCs w:val="20"/>
+                  <w:lang w:val="pt-BR"/>
+                </w:rPr>
+                <w:delText>Carimbo de tempo com fuso horário; tipo do evento, movimentação ou ocorrência; valor de 0 a 1 para a movimentação, normalizado no ponto; rótulo para a ocorrência — segurança, trânsito ou encerrada; abrangência; origem; vigência opcional. Campo fora do contrato é recusado</w:delText>
+              </w:r>
+            </w:del>
+            <w:ins w:id="30102" w:author="Vitor Oliveira" w:date="2026-09-28T12:00:00Z">
+              <w:r>
+                <w:rPr>
+                  <w:sz w:val="20"/>
+                  <w:szCs w:val="20"/>
+                  <w:lang w:val="pt-BR"/>
+                </w:rPr>
+                <w:t xml:space="preserve">Carimbo de tempo com fuso horário; número de pessoas na área do trecho, inteiro não negativo; ocorrência, segurança ou trânsito, ausente quando não há; trecho de via, pelo código do segmento de logradouro no cadastro municipal; origem; vigência opcional. Exige chave de acesso; campo fora do contrato ou trecho fora do cadastro é recusado</w:t>
+              </w:r>
+            </w:ins>
           </w:p>
         </w:tc>
       </w:tr>
@@ -17905,14 +18894,26 @@
                 <w:lang w:val="pt-BR"/>
               </w:rPr>
             </w:pPr>
-            <w:r>
-              <w:rPr>
-                <w:sz w:val="20"/>
-                <w:szCs w:val="20"/>
-                <w:lang w:val="pt-BR"/>
-              </w:rPr>
-              <w:t>Coleção de eventos, filtrada por carimbo de tempo</w:t>
-            </w:r>
+            <w:del w:id="30103" w:author="Vitor Oliveira" w:date="2026-09-28T12:00:00Z">
+              <w:r>
+                <w:rPr>
+                  <w:sz w:val="20"/>
+                  <w:szCs w:val="20"/>
+                  <w:lang w:val="pt-BR"/>
+                </w:rPr>
+                <w:delText>Coleção de eventos, filtrada por carimbo de tempo</w:delText>
+              </w:r>
+            </w:del>
+            <w:ins w:id="30104" w:author="Vitor Oliveira" w:date="2026-09-28T12:00:00Z">
+              <w:r>
+                <w:rPr>
+                  <w:sz w:val="20"/>
+                  <w:szCs w:val="20"/>
+                  <w:lang w:val="pt-BR"/>
+                </w:rPr>
+                <w:t xml:space="preserve">Coleção de leituras, filtrada por carimbo de tempo e por trecho</w:t>
+              </w:r>
+            </w:ins>
           </w:p>
         </w:tc>
       </w:tr>
@@ -17979,14 +18980,26 @@
                 <w:lang w:val="pt-BR"/>
               </w:rPr>
             </w:pPr>
-            <w:r>
-              <w:rPr>
-                <w:sz w:val="20"/>
-                <w:szCs w:val="20"/>
-                <w:lang w:val="pt-BR"/>
-              </w:rPr>
-              <w:t>Nível pretendido, nível emitido, restrição aplicada e versão da base de regras</w:t>
-            </w:r>
+            <w:del w:id="30105" w:author="Vitor Oliveira" w:date="2026-09-28T12:00:00Z">
+              <w:r>
+                <w:rPr>
+                  <w:sz w:val="20"/>
+                  <w:szCs w:val="20"/>
+                  <w:lang w:val="pt-BR"/>
+                </w:rPr>
+                <w:delText>Nível pretendido, nível emitido, restrição aplicada e versão da base de regras</w:delText>
+              </w:r>
+            </w:del>
+            <w:ins w:id="30106" w:author="Vitor Oliveira" w:date="2026-09-28T12:00:00Z">
+              <w:r>
+                <w:rPr>
+                  <w:sz w:val="20"/>
+                  <w:szCs w:val="20"/>
+                  <w:lang w:val="pt-BR"/>
+                </w:rPr>
+                <w:t xml:space="preserve">Nível pretendido, nível emitido, restrição aplicada e versão da base de regras, com as entradas da inferência e o grau de cada regra ativada</w:t>
+              </w:r>
+            </w:ins>
           </w:p>
         </w:tc>
       </w:tr>
@@ -18065,6 +19078,9 @@
         </w:tc>
       </w:tr>
       <w:tr>
+        <w:trPr>
+          <w:ins w:id="30107" w:author="Vitor Oliveira" w:date="2026-09-28T12:00:00Z"/>
+        </w:trPr>
         <w:tc>
           <w:tcPr>
             <w:tcW w:w="2600" w:type="dxa"/>
@@ -18076,13 +19092,20 @@
             </w:tcMar>
           </w:tcPr>
           <w:p>
-            <w:r>
-              <w:rPr>
-                <w:sz w:val="20"/>
-                <w:szCs w:val="20"/>
-              </w:rPr>
-              <w:t>REST – GET /pontos</w:t>
-            </w:r>
+            <w:pPr>
+              <w:rPr>
+                <w:ins w:id="30108" w:author="Vitor Oliveira" w:date="2026-09-28T12:00:00Z"/>
+              </w:rPr>
+            </w:pPr>
+            <w:ins w:id="30109" w:author="Vitor Oliveira" w:date="2026-09-28T12:00:00Z">
+              <w:r>
+                <w:rPr>
+                  <w:sz w:val="20"/>
+                  <w:szCs w:val="20"/>
+                </w:rPr>
+                <w:t xml:space="preserve">REST – GET /trechos</w:t>
+              </w:r>
+            </w:ins>
           </w:p>
         </w:tc>
         <w:tc>
@@ -18096,14 +19119,21 @@
             </w:tcMar>
           </w:tcPr>
           <w:p>
-            <w:r>
-              <w:rPr>
-                <w:sz w:val="20"/>
-                <w:szCs w:val="20"/>
-                <w:lang w:val="pt-BR"/>
-              </w:rPr>
-              <w:t>Consulta de apresentação, usada pelo painel</w:t>
-            </w:r>
+            <w:pPr>
+              <w:rPr>
+                <w:ins w:id="30110" w:author="Vitor Oliveira" w:date="2026-09-28T12:00:00Z"/>
+              </w:rPr>
+            </w:pPr>
+            <w:ins w:id="30111" w:author="Vitor Oliveira" w:date="2026-09-28T12:00:00Z">
+              <w:r>
+                <w:rPr>
+                  <w:sz w:val="20"/>
+                  <w:szCs w:val="20"/>
+                  <w:lang w:val="pt-BR"/>
+                </w:rPr>
+                <w:t xml:space="preserve">Consulta do cadastro espacial</w:t>
+              </w:r>
+            </w:ins>
           </w:p>
         </w:tc>
         <w:tc>
@@ -18117,14 +19147,21 @@
             </w:tcMar>
           </w:tcPr>
           <w:p>
-            <w:r>
-              <w:rPr>
-                <w:sz w:val="20"/>
-                <w:szCs w:val="20"/>
-                <w:lang w:val="pt-BR"/>
-              </w:rPr>
-              <w:t>Estado operacional, classe, piso, última decisão e última medição de cada ponto de luz</w:t>
-            </w:r>
+            <w:pPr>
+              <w:rPr>
+                <w:ins w:id="30112" w:author="Vitor Oliveira" w:date="2026-09-28T12:00:00Z"/>
+              </w:rPr>
+            </w:pPr>
+            <w:ins w:id="30113" w:author="Vitor Oliveira" w:date="2026-09-28T12:00:00Z">
+              <w:r>
+                <w:rPr>
+                  <w:sz w:val="20"/>
+                  <w:szCs w:val="20"/>
+                  <w:lang w:val="pt-BR"/>
+                </w:rPr>
+                <w:t xml:space="preserve">Trechos de via com logradouro, faixa de numeração e pontos de luz associados: o vocabulário de lugares da integração</w:t>
+              </w:r>
+            </w:ins>
           </w:p>
         </w:tc>
       </w:tr>
@@ -18145,7 +19182,7 @@
                 <w:sz w:val="20"/>
                 <w:szCs w:val="20"/>
               </w:rPr>
-              <w:t>REST – GET /alertas</w:t>
+              <w:t>REST – GET /pontos</w:t>
             </w:r>
           </w:p>
         </w:tc>
@@ -18181,14 +19218,26 @@
             </w:tcMar>
           </w:tcPr>
           <w:p>
-            <w:r>
-              <w:rPr>
-                <w:sz w:val="20"/>
-                <w:szCs w:val="20"/>
-                <w:lang w:val="pt-BR"/>
-              </w:rPr>
-              <w:t>Alertas de diagnóstico abertos (RF11)</w:t>
-            </w:r>
+            <w:del w:id="30114" w:author="Vitor Oliveira" w:date="2026-09-28T12:00:00Z">
+              <w:r>
+                <w:rPr>
+                  <w:sz w:val="20"/>
+                  <w:szCs w:val="20"/>
+                  <w:lang w:val="pt-BR"/>
+                </w:rPr>
+                <w:delText>Estado operacional, classe, piso, última decisão e última medição de cada ponto de luz</w:delText>
+              </w:r>
+            </w:del>
+            <w:ins w:id="30115" w:author="Vitor Oliveira" w:date="2026-09-28T12:00:00Z">
+              <w:r>
+                <w:rPr>
+                  <w:sz w:val="20"/>
+                  <w:szCs w:val="20"/>
+                  <w:lang w:val="pt-BR"/>
+                </w:rPr>
+                <w:t xml:space="preserve">Estado operacional, classe, piso, placa, trechos associados, última decisão e última medição de cada ponto de luz</w:t>
+              </w:r>
+            </w:ins>
           </w:p>
         </w:tc>
       </w:tr>
@@ -18209,7 +19258,7 @@
                 <w:sz w:val="20"/>
                 <w:szCs w:val="20"/>
               </w:rPr>
-              <w:t>REST – GET /energia</w:t>
+              <w:t>REST – GET /alertas</w:t>
             </w:r>
           </w:p>
         </w:tc>
@@ -18251,7 +19300,7 @@
                 <w:szCs w:val="20"/>
                 <w:lang w:val="pt-BR"/>
               </w:rPr>
-              <w:t>Potência e energia da luminária de referência, pela luz medida e pelo comando, ao lado das linhas de base de 3.11</w:t>
+              <w:t>Alertas de diagnóstico abertos (RF11)</w:t>
             </w:r>
           </w:p>
         </w:tc>
@@ -18273,7 +19322,7 @@
                 <w:sz w:val="20"/>
                 <w:szCs w:val="20"/>
               </w:rPr>
-              <w:t>MQTT – iluminacao/{ponto}/comando</w:t>
+              <w:t>REST – GET /energia</w:t>
             </w:r>
           </w:p>
         </w:tc>
@@ -18292,8 +19341,9 @@
               <w:rPr>
                 <w:sz w:val="20"/>
                 <w:szCs w:val="20"/>
-              </w:rPr>
-              <w:t>Tópico assinado pelo nó</w:t>
+                <w:lang w:val="pt-BR"/>
+              </w:rPr>
+              <w:t>Consulta de apresentação, usada pelo painel</w:t>
             </w:r>
           </w:p>
         </w:tc>
@@ -18308,23 +19358,21 @@
             </w:tcMar>
           </w:tcPr>
           <w:p>
-            <w:pPr>
-              <w:rPr>
-                <w:lang w:val="pt-BR"/>
-              </w:rPr>
-            </w:pPr>
-            <w:r>
-              <w:rPr>
-                <w:sz w:val="20"/>
-                <w:szCs w:val="20"/>
-                <w:lang w:val="pt-BR"/>
-              </w:rPr>
-              <w:t>Nível emitido, expresso como fração do fluxo pleno, e identificador da decisão</w:t>
+            <w:r>
+              <w:rPr>
+                <w:sz w:val="20"/>
+                <w:szCs w:val="20"/>
+                <w:lang w:val="pt-BR"/>
+              </w:rPr>
+              <w:t>Potência e energia da luminária de referência, pela luz medida e pelo comando, ao lado das linhas de base de 3.11</w:t>
             </w:r>
           </w:p>
         </w:tc>
       </w:tr>
       <w:tr>
+        <w:trPr>
+          <w:ins w:id="30116" w:author="Vitor Oliveira" w:date="2026-09-28T12:00:00Z"/>
+        </w:trPr>
         <w:tc>
           <w:tcPr>
             <w:tcW w:w="2600" w:type="dxa"/>
@@ -18336,13 +19384,20 @@
             </w:tcMar>
           </w:tcPr>
           <w:p>
-            <w:r>
-              <w:rPr>
-                <w:sz w:val="20"/>
-                <w:szCs w:val="20"/>
-              </w:rPr>
-              <w:t>MQTT – iluminacao/{ponto}/telemetria</w:t>
-            </w:r>
+            <w:pPr>
+              <w:rPr>
+                <w:ins w:id="30117" w:author="Vitor Oliveira" w:date="2026-09-28T12:00:00Z"/>
+              </w:rPr>
+            </w:pPr>
+            <w:ins w:id="30118" w:author="Vitor Oliveira" w:date="2026-09-28T12:00:00Z">
+              <w:r>
+                <w:rPr>
+                  <w:sz w:val="20"/>
+                  <w:szCs w:val="20"/>
+                </w:rPr>
+                <w:t xml:space="preserve">REST – GET /eventos/{id}/explicacao</w:t>
+              </w:r>
+            </w:ins>
           </w:p>
         </w:tc>
         <w:tc>
@@ -18356,13 +19411,21 @@
             </w:tcMar>
           </w:tcPr>
           <w:p>
-            <w:r>
-              <w:rPr>
-                <w:sz w:val="20"/>
-                <w:szCs w:val="20"/>
-              </w:rPr>
-              <w:t>Tópico publicado pelo nó</w:t>
-            </w:r>
+            <w:pPr>
+              <w:rPr>
+                <w:ins w:id="30119" w:author="Vitor Oliveira" w:date="2026-09-28T12:00:00Z"/>
+              </w:rPr>
+            </w:pPr>
+            <w:ins w:id="30120" w:author="Vitor Oliveira" w:date="2026-09-28T12:00:00Z">
+              <w:r>
+                <w:rPr>
+                  <w:sz w:val="20"/>
+                  <w:szCs w:val="20"/>
+                  <w:lang w:val="pt-BR"/>
+                </w:rPr>
+                <w:t xml:space="preserve">Consulta de apresentação, usada pelo painel</w:t>
+              </w:r>
+            </w:ins>
           </w:p>
         </w:tc>
         <w:tc>
@@ -18378,17 +19441,19 @@
           <w:p>
             <w:pPr>
               <w:rPr>
-                <w:lang w:val="pt-BR"/>
+                <w:ins w:id="30121" w:author="Vitor Oliveira" w:date="2026-09-28T12:00:00Z"/>
               </w:rPr>
             </w:pPr>
-            <w:r>
-              <w:rPr>
-                <w:sz w:val="20"/>
-                <w:szCs w:val="20"/>
-                <w:lang w:val="pt-BR"/>
-              </w:rPr>
-              <w:t>Ciclo de trabalho efetivamente aplicado, iluminância medida e identificador da decisão correspondente</w:t>
-            </w:r>
+            <w:ins w:id="30122" w:author="Vitor Oliveira" w:date="2026-09-28T12:00:00Z">
+              <w:r>
+                <w:rPr>
+                  <w:sz w:val="20"/>
+                  <w:szCs w:val="20"/>
+                  <w:lang w:val="pt-BR"/>
+                </w:rPr>
+                <w:t xml:space="preserve">Para uma leitura, a cadeia de cada ponto de luz afetado: entradas, regras ativadas com texto, origem e grau, nível pretendido, restrição e seu motivo, nível emitido e iluminância medida</w:t>
+              </w:r>
+            </w:ins>
           </w:p>
         </w:tc>
       </w:tr>
@@ -18409,6 +19474,142 @@
                 <w:sz w:val="20"/>
                 <w:szCs w:val="20"/>
               </w:rPr>
+              <w:t>MQTT – iluminacao/{ponto}/comando</w:t>
+            </w:r>
+          </w:p>
+        </w:tc>
+        <w:tc>
+          <w:tcPr>
+            <w:tcW w:w="2700" w:type="dxa"/>
+            <w:tcMar>
+              <w:top w:w="70" w:type="dxa"/>
+              <w:left w:w="90" w:type="dxa"/>
+              <w:bottom w:w="70" w:type="dxa"/>
+              <w:right w:w="90" w:type="dxa"/>
+            </w:tcMar>
+          </w:tcPr>
+          <w:p>
+            <w:r>
+              <w:rPr>
+                <w:sz w:val="20"/>
+                <w:szCs w:val="20"/>
+              </w:rPr>
+              <w:t>Tópico assinado pelo nó</w:t>
+            </w:r>
+          </w:p>
+        </w:tc>
+        <w:tc>
+          <w:tcPr>
+            <w:tcW w:w="3771" w:type="dxa"/>
+            <w:tcMar>
+              <w:top w:w="70" w:type="dxa"/>
+              <w:left w:w="90" w:type="dxa"/>
+              <w:bottom w:w="70" w:type="dxa"/>
+              <w:right w:w="90" w:type="dxa"/>
+            </w:tcMar>
+          </w:tcPr>
+          <w:p>
+            <w:pPr>
+              <w:rPr>
+                <w:lang w:val="pt-BR"/>
+              </w:rPr>
+            </w:pPr>
+            <w:r>
+              <w:rPr>
+                <w:sz w:val="20"/>
+                <w:szCs w:val="20"/>
+                <w:lang w:val="pt-BR"/>
+              </w:rPr>
+              <w:t>Nível emitido, expresso como fração do fluxo pleno, e identificador da decisão</w:t>
+            </w:r>
+          </w:p>
+        </w:tc>
+      </w:tr>
+      <w:tr>
+        <w:tc>
+          <w:tcPr>
+            <w:tcW w:w="2600" w:type="dxa"/>
+            <w:tcMar>
+              <w:top w:w="70" w:type="dxa"/>
+              <w:left w:w="90" w:type="dxa"/>
+              <w:bottom w:w="70" w:type="dxa"/>
+              <w:right w:w="90" w:type="dxa"/>
+            </w:tcMar>
+          </w:tcPr>
+          <w:p>
+            <w:r>
+              <w:rPr>
+                <w:sz w:val="20"/>
+                <w:szCs w:val="20"/>
+              </w:rPr>
+              <w:t>MQTT – iluminacao/{ponto}/telemetria</w:t>
+            </w:r>
+          </w:p>
+        </w:tc>
+        <w:tc>
+          <w:tcPr>
+            <w:tcW w:w="2700" w:type="dxa"/>
+            <w:tcMar>
+              <w:top w:w="70" w:type="dxa"/>
+              <w:left w:w="90" w:type="dxa"/>
+              <w:bottom w:w="70" w:type="dxa"/>
+              <w:right w:w="90" w:type="dxa"/>
+            </w:tcMar>
+          </w:tcPr>
+          <w:p>
+            <w:r>
+              <w:rPr>
+                <w:sz w:val="20"/>
+                <w:szCs w:val="20"/>
+              </w:rPr>
+              <w:t>Tópico publicado pelo nó</w:t>
+            </w:r>
+          </w:p>
+        </w:tc>
+        <w:tc>
+          <w:tcPr>
+            <w:tcW w:w="3771" w:type="dxa"/>
+            <w:tcMar>
+              <w:top w:w="70" w:type="dxa"/>
+              <w:left w:w="90" w:type="dxa"/>
+              <w:bottom w:w="70" w:type="dxa"/>
+              <w:right w:w="90" w:type="dxa"/>
+            </w:tcMar>
+          </w:tcPr>
+          <w:p>
+            <w:pPr>
+              <w:rPr>
+                <w:lang w:val="pt-BR"/>
+              </w:rPr>
+            </w:pPr>
+            <w:r>
+              <w:rPr>
+                <w:sz w:val="20"/>
+                <w:szCs w:val="20"/>
+                <w:lang w:val="pt-BR"/>
+              </w:rPr>
+              <w:t>Ciclo de trabalho efetivamente aplicado, iluminância medida e identificador da decisão correspondente</w:t>
+            </w:r>
+          </w:p>
+        </w:tc>
+      </w:tr>
+      <w:tr>
+        <w:tc>
+          <w:tcPr>
+            <w:tcW w:w="2600" w:type="dxa"/>
+            <w:tcMar>
+              <w:top w:w="70" w:type="dxa"/>
+              <w:left w:w="90" w:type="dxa"/>
+              <w:bottom w:w="70" w:type="dxa"/>
+              <w:right w:w="90" w:type="dxa"/>
+            </w:tcMar>
+          </w:tcPr>
+          <w:p>
+            <w:r>
+              <w:rPr>
+                <w:sz w:val="20"/>
+                <w:szCs w:val="20"/>
+              </w:rPr>
               <w:t>MQTT – iluminacao/{ponto}/estado</w:t>
             </w:r>
           </w:p>
@@ -18494,11 +19695,27 @@
         <w:ind w:firstLine="709"/>
         <w:jc w:val="both"/>
       </w:pPr>
-      <w:r>
-        <w:rPr>
-          <w:lang w:val="pt-BR"/>
-        </w:rPr>
-        <w:t>As três consultas de apresentação servem apenas ao painel e não integram a especificação de integração. Comando e telemetria trafegam com qualidade de serviço 1 e sem retenção: um comando retido faria o nó que reconecta aplicar decisão antiga. A eventual reentrega é absorvida pela unicidade do identificador da decisão na telemetria. O tópico de estado é retido e carrega a última vontade do nó, o que permite ao serviço marcar o ponto como sem comunicação.</w:t>
+      <w:del w:id="30123" w:author="Vitor Oliveira" w:date="2026-09-28T12:00:00Z">
+        <w:r>
+          <w:rPr>
+            <w:lang w:val="pt-BR"/>
+          </w:rPr>
+          <w:delText xml:space="preserve">As três consultas de apresentação servem apenas ao painel e não integram a especificação de integração.</w:delText>
+        </w:r>
+      </w:del>
+      <w:ins w:id="30124" w:author="Vitor Oliveira" w:date="2026-09-28T12:00:00Z">
+        <w:r>
+          <w:rPr>
+            <w:lang w:val="pt-BR"/>
+          </w:rPr>
+          <w:t xml:space="preserve">As consultas de apresentação — pontos, alertas, energia e explicação — servem apenas ao painel e não integram a especificação de integração; a consulta de trechos a integra, por definir os lugares a que as leituras se referem.</w:t>
+        </w:r>
+      </w:ins>
+      <w:r>
+        <w:rPr>
+          <w:lang w:val="pt-BR"/>
+        </w:rPr>
+        <w:t xml:space="preserve"> Comando e telemetria trafegam com qualidade de serviço 1 e sem retenção: um comando retido faria o nó que reconecta aplicar decisão antiga. A eventual reentrega é absorvida pela unicidade do identificador da decisão na telemetria. O tópico de estado é retido e carrega a última vontade do nó, o que permite ao serviço marcar o ponto como sem comunicação.</w:t>
       </w:r>
     </w:p>
     <w:p>
@@ -18823,13 +20040,33 @@
                 <w:lang w:val="pt-BR"/>
               </w:rPr>
             </w:pPr>
-            <w:r>
-              <w:rPr>
-                <w:sz w:val="20"/>
-                <w:szCs w:val="20"/>
-                <w:lang w:val="pt-BR"/>
-              </w:rPr>
-              <w:t>Identificador; coordenadas; logradouro; classe de iluminação; estado operacional; potência plena do segmento</w:t>
+            <w:del w:id="30125" w:author="Vitor Oliveira" w:date="2026-09-28T12:00:00Z">
+              <w:r>
+                <w:rPr>
+                  <w:sz w:val="20"/>
+                  <w:szCs w:val="20"/>
+                  <w:lang w:val="pt-BR"/>
+                </w:rPr>
+                <w:delText xml:space="preserve">Identificador; coordenadas; logradouro;</w:delText>
+              </w:r>
+            </w:del>
+            <w:ins w:id="30126" w:author="Vitor Oliveira" w:date="2026-09-28T12:00:00Z">
+              <w:r>
+                <w:rPr>
+                  <w:sz w:val="20"/>
+                  <w:szCs w:val="20"/>
+                  <w:lang w:val="pt-BR"/>
+                </w:rPr>
+                <w:t xml:space="preserve">Identificador; placa do cadastro municipal; coordenadas geográficas e planas; logradouro;</w:t>
+              </w:r>
+            </w:ins>
+            <w:r>
+              <w:rPr>
+                <w:sz w:val="20"/>
+                <w:szCs w:val="20"/>
+                <w:lang w:val="pt-BR"/>
+              </w:rPr>
+              <w:t xml:space="preserve"> classe de iluminação; estado operacional; potência plena do segmento</w:t>
             </w:r>
           </w:p>
         </w:tc>
@@ -18855,12 +20092,35 @@
                 <w:szCs w:val="20"/>
                 <w:lang w:val="pt-BR"/>
               </w:rPr>
-              <w:t>Representa a luminária. Na avaliação existe um único registro, correspondente ao nó de bancada; o modelo, contudo, é o do parque</w:t>
-            </w:r>
+              <w:t xml:space="preserve">Representa a luminária. </w:t>
+            </w:r>
+            <w:del w:id="30127" w:author="Vitor Oliveira" w:date="2026-09-28T12:00:00Z">
+              <w:r>
+                <w:rPr>
+                  <w:sz w:val="20"/>
+                  <w:szCs w:val="20"/>
+                  <w:lang w:val="pt-BR"/>
+                </w:rPr>
+                <w:delText xml:space="preserve">Na avaliação existe um único registro, correspondente ao nó de bancada; o modelo, contudo, é o do parque</w:delText>
+              </w:r>
+            </w:del>
+            <w:ins w:id="30128" w:author="Vitor Oliveira" w:date="2026-09-28T12:00:00Z">
+              <w:r>
+                <w:rPr>
+                  <w:sz w:val="20"/>
+                  <w:szCs w:val="20"/>
+                  <w:lang w:val="pt-BR"/>
+                </w:rPr>
+                <w:t xml:space="preserve">Na avaliação, dois registros — o nó de bancada e um ponto simulado —, cada um representando um poste real do cadastro; o modelo é o do parque</w:t>
+              </w:r>
+            </w:ins>
           </w:p>
         </w:tc>
       </w:tr>
       <w:tr>
+        <w:trPr>
+          <w:ins w:id="30135" w:author="Vitor Oliveira" w:date="2026-09-28T12:00:00Z"/>
+        </w:trPr>
         <w:tc>
           <w:tcPr>
             <w:tcW w:w="2100" w:type="dxa"/>
@@ -18872,13 +20132,20 @@
             </w:tcMar>
           </w:tcPr>
           <w:p>
-            <w:r>
-              <w:rPr>
-                <w:sz w:val="20"/>
-                <w:szCs w:val="20"/>
-              </w:rPr>
-              <w:t>evento_urbano</w:t>
-            </w:r>
+            <w:pPr>
+              <w:rPr>
+                <w:ins w:id="30136" w:author="Vitor Oliveira" w:date="2026-09-28T12:00:00Z"/>
+              </w:rPr>
+            </w:pPr>
+            <w:ins w:id="30137" w:author="Vitor Oliveira" w:date="2026-09-28T12:00:00Z">
+              <w:r>
+                <w:rPr>
+                  <w:sz w:val="20"/>
+                  <w:szCs w:val="20"/>
+                </w:rPr>
+                <w:t xml:space="preserve">trecho_via</w:t>
+              </w:r>
+            </w:ins>
           </w:p>
         </w:tc>
         <w:tc>
@@ -18894,17 +20161,19 @@
           <w:p>
             <w:pPr>
               <w:rPr>
-                <w:lang w:val="pt-BR"/>
+                <w:ins w:id="30138" w:author="Vitor Oliveira" w:date="2026-09-28T12:00:00Z"/>
               </w:rPr>
             </w:pPr>
-            <w:r>
-              <w:rPr>
-                <w:sz w:val="20"/>
-                <w:szCs w:val="20"/>
-                <w:lang w:val="pt-BR"/>
-              </w:rPr>
-              <w:t>Carimbo de tempo; tipo; valor; rótulo; abrangência; origem; vigência</w:t>
-            </w:r>
+            <w:ins w:id="30139" w:author="Vitor Oliveira" w:date="2026-09-28T12:00:00Z">
+              <w:r>
+                <w:rPr>
+                  <w:sz w:val="20"/>
+                  <w:szCs w:val="20"/>
+                  <w:lang w:val="pt-BR"/>
+                </w:rPr>
+                <w:t xml:space="preserve">Código do segmento no cadastro municipal; código, tipo e nome do logradouro; faixa de numeração; geometria; referência de pessoas</w:t>
+              </w:r>
+            </w:ins>
           </w:p>
         </w:tc>
         <w:tc>
@@ -18920,21 +20189,27 @@
           <w:p>
             <w:pPr>
               <w:rPr>
-                <w:lang w:val="pt-BR"/>
+                <w:ins w:id="30140" w:author="Vitor Oliveira" w:date="2026-09-28T12:00:00Z"/>
               </w:rPr>
             </w:pPr>
-            <w:r>
-              <w:rPr>
-                <w:sz w:val="20"/>
-                <w:szCs w:val="20"/>
-                <w:lang w:val="pt-BR"/>
-              </w:rPr>
-              <w:t xml:space="preserve">Registra cada mensagem recebida da interface de dados urbanos: nível de movimentação e ocorrência reportada</w:t>
-            </w:r>
+            <w:ins w:id="30141" w:author="Vitor Oliveira" w:date="2026-09-28T12:00:00Z">
+              <w:r>
+                <w:rPr>
+                  <w:sz w:val="20"/>
+                  <w:szCs w:val="20"/>
+                  <w:lang w:val="pt-BR"/>
+                </w:rPr>
+                <w:t xml:space="preserve">Unidade espacial das leituras (3.5.2). A referência normaliza a série da previsão como no treino (3.6)</w:t>
+              </w:r>
+            </w:ins>
           </w:p>
         </w:tc>
       </w:tr>
       <w:tr>
+        <w:trPr>
+          <w:ins w:id="30135" w:author="Vitor Oliveira" w:date="2026-09-28T12:00:00Z"/>
+          <w:ins w:id="30142" w:author="Vitor Oliveira" w:date="2026-09-28T12:00:00Z"/>
+        </w:trPr>
         <w:tc>
           <w:tcPr>
             <w:tcW w:w="2100" w:type="dxa"/>
@@ -18946,13 +20221,20 @@
             </w:tcMar>
           </w:tcPr>
           <w:p>
-            <w:r>
-              <w:rPr>
-                <w:sz w:val="20"/>
-                <w:szCs w:val="20"/>
-              </w:rPr>
-              <w:t>versao_base_regras</w:t>
-            </w:r>
+            <w:pPr>
+              <w:rPr>
+                <w:ins w:id="30143" w:author="Vitor Oliveira" w:date="2026-09-28T12:00:00Z"/>
+              </w:rPr>
+            </w:pPr>
+            <w:ins w:id="30144" w:author="Vitor Oliveira" w:date="2026-09-28T12:00:00Z">
+              <w:r>
+                <w:rPr>
+                  <w:sz w:val="20"/>
+                  <w:szCs w:val="20"/>
+                </w:rPr>
+                <w:t xml:space="preserve">trecho_ponto</w:t>
+              </w:r>
+            </w:ins>
           </w:p>
         </w:tc>
         <w:tc>
@@ -18968,17 +20250,19 @@
           <w:p>
             <w:pPr>
               <w:rPr>
-                <w:lang w:val="pt-BR"/>
+                <w:ins w:id="30145" w:author="Vitor Oliveira" w:date="2026-09-28T12:00:00Z"/>
               </w:rPr>
             </w:pPr>
-            <w:r>
-              <w:rPr>
-                <w:sz w:val="20"/>
-                <w:szCs w:val="20"/>
-                <w:lang w:val="pt-BR"/>
-              </w:rPr>
-              <w:t>Identificador; data de vigência; quantidade de regras; resumo das alterações; hash do arquivo de regras</w:t>
-            </w:r>
+            <w:ins w:id="30146" w:author="Vitor Oliveira" w:date="2026-09-28T12:00:00Z">
+              <w:r>
+                <w:rPr>
+                  <w:sz w:val="20"/>
+                  <w:szCs w:val="20"/>
+                  <w:lang w:val="pt-BR"/>
+                </w:rPr>
+                <w:t xml:space="preserve">Trecho; ponto de luz; distância; critério; instante da associação</w:t>
+              </w:r>
+            </w:ins>
           </w:p>
         </w:tc>
         <w:tc>
@@ -18994,17 +20278,19 @@
           <w:p>
             <w:pPr>
               <w:rPr>
-                <w:lang w:val="pt-BR"/>
+                <w:ins w:id="30147" w:author="Vitor Oliveira" w:date="2026-09-28T12:00:00Z"/>
               </w:rPr>
             </w:pPr>
-            <w:r>
-              <w:rPr>
-                <w:sz w:val="20"/>
-                <w:szCs w:val="20"/>
-                <w:lang w:val="pt-BR"/>
-              </w:rPr>
-              <w:t>Atribui cada decisão à versão da base que a produziu. É a condição para reproduzir qualquer resultado após uma alteração de regras</w:t>
-            </w:r>
+            <w:ins w:id="30148" w:author="Vitor Oliveira" w:date="2026-09-28T12:00:00Z">
+              <w:r>
+                <w:rPr>
+                  <w:sz w:val="20"/>
+                  <w:szCs w:val="20"/>
+                  <w:lang w:val="pt-BR"/>
+                </w:rPr>
+                <w:t xml:space="preserve">Associa trechos a pontos de luz, na relação de muitos para muitos, com a regra que produziu cada associação (3.5.2)</w:t>
+              </w:r>
+            </w:ins>
           </w:p>
         </w:tc>
       </w:tr>
@@ -19025,6 +20311,178 @@
                 <w:sz w:val="20"/>
                 <w:szCs w:val="20"/>
               </w:rPr>
+              <w:t>evento_urbano</w:t>
+            </w:r>
+          </w:p>
+        </w:tc>
+        <w:tc>
+          <w:tcPr>
+            <w:tcW w:w="3200" w:type="dxa"/>
+            <w:tcMar>
+              <w:top w:w="70" w:type="dxa"/>
+              <w:left w:w="90" w:type="dxa"/>
+              <w:bottom w:w="70" w:type="dxa"/>
+              <w:right w:w="90" w:type="dxa"/>
+            </w:tcMar>
+          </w:tcPr>
+          <w:p>
+            <w:pPr>
+              <w:rPr>
+                <w:lang w:val="pt-BR"/>
+              </w:rPr>
+            </w:pPr>
+            <w:del w:id="30129" w:author="Vitor Oliveira" w:date="2026-09-28T12:00:00Z">
+              <w:r>
+                <w:rPr>
+                  <w:sz w:val="20"/>
+                  <w:szCs w:val="20"/>
+                  <w:lang w:val="pt-BR"/>
+                </w:rPr>
+                <w:delText>Carimbo de tempo; tipo; valor; rótulo; abrangência; origem; vigência</w:delText>
+              </w:r>
+            </w:del>
+            <w:ins w:id="30130" w:author="Vitor Oliveira" w:date="2026-09-28T12:00:00Z">
+              <w:r>
+                <w:rPr>
+                  <w:sz w:val="20"/>
+                  <w:szCs w:val="20"/>
+                  <w:lang w:val="pt-BR"/>
+                </w:rPr>
+                <w:t xml:space="preserve">Carimbo de tempo; número de pessoas; ocorrência; trecho; origem; vigência</w:t>
+              </w:r>
+            </w:ins>
+          </w:p>
+        </w:tc>
+        <w:tc>
+          <w:tcPr>
+            <w:tcW w:w="3771" w:type="dxa"/>
+            <w:tcMar>
+              <w:top w:w="70" w:type="dxa"/>
+              <w:left w:w="90" w:type="dxa"/>
+              <w:bottom w:w="70" w:type="dxa"/>
+              <w:right w:w="90" w:type="dxa"/>
+            </w:tcMar>
+          </w:tcPr>
+          <w:p>
+            <w:pPr>
+              <w:rPr>
+                <w:lang w:val="pt-BR"/>
+              </w:rPr>
+            </w:pPr>
+            <w:del w:id="30131" w:author="Vitor Oliveira" w:date="2026-09-28T12:00:00Z">
+              <w:r>
+                <w:rPr>
+                  <w:sz w:val="20"/>
+                  <w:szCs w:val="20"/>
+                  <w:lang w:val="pt-BR"/>
+                </w:rPr>
+                <w:delText xml:space="preserve">Registra cada mensagem recebida da interface de dados urbanos: nível de movimentação e ocorrência reportada</w:delText>
+              </w:r>
+            </w:del>
+            <w:ins w:id="30132" w:author="Vitor Oliveira" w:date="2026-09-28T12:00:00Z">
+              <w:r>
+                <w:rPr>
+                  <w:sz w:val="20"/>
+                  <w:szCs w:val="20"/>
+                  <w:lang w:val="pt-BR"/>
+                </w:rPr>
+                <w:t xml:space="preserve">Registra cada leitura de trecho recebida da interface de dados urbanos: pessoas presentes e ocorrência reportada</w:t>
+              </w:r>
+            </w:ins>
+          </w:p>
+        </w:tc>
+      </w:tr>
+      <w:tr>
+        <w:tc>
+          <w:tcPr>
+            <w:tcW w:w="2100" w:type="dxa"/>
+            <w:tcMar>
+              <w:top w:w="70" w:type="dxa"/>
+              <w:left w:w="90" w:type="dxa"/>
+              <w:bottom w:w="70" w:type="dxa"/>
+              <w:right w:w="90" w:type="dxa"/>
+            </w:tcMar>
+          </w:tcPr>
+          <w:p>
+            <w:r>
+              <w:rPr>
+                <w:sz w:val="20"/>
+                <w:szCs w:val="20"/>
+              </w:rPr>
+              <w:t>versao_base_regras</w:t>
+            </w:r>
+          </w:p>
+        </w:tc>
+        <w:tc>
+          <w:tcPr>
+            <w:tcW w:w="3200" w:type="dxa"/>
+            <w:tcMar>
+              <w:top w:w="70" w:type="dxa"/>
+              <w:left w:w="90" w:type="dxa"/>
+              <w:bottom w:w="70" w:type="dxa"/>
+              <w:right w:w="90" w:type="dxa"/>
+            </w:tcMar>
+          </w:tcPr>
+          <w:p>
+            <w:pPr>
+              <w:rPr>
+                <w:lang w:val="pt-BR"/>
+              </w:rPr>
+            </w:pPr>
+            <w:r>
+              <w:rPr>
+                <w:sz w:val="20"/>
+                <w:szCs w:val="20"/>
+                <w:lang w:val="pt-BR"/>
+              </w:rPr>
+              <w:t>Identificador; data de vigência; quantidade de regras; resumo das alterações; hash do arquivo de regras</w:t>
+            </w:r>
+          </w:p>
+        </w:tc>
+        <w:tc>
+          <w:tcPr>
+            <w:tcW w:w="3771" w:type="dxa"/>
+            <w:tcMar>
+              <w:top w:w="70" w:type="dxa"/>
+              <w:left w:w="90" w:type="dxa"/>
+              <w:bottom w:w="70" w:type="dxa"/>
+              <w:right w:w="90" w:type="dxa"/>
+            </w:tcMar>
+          </w:tcPr>
+          <w:p>
+            <w:pPr>
+              <w:rPr>
+                <w:lang w:val="pt-BR"/>
+              </w:rPr>
+            </w:pPr>
+            <w:r>
+              <w:rPr>
+                <w:sz w:val="20"/>
+                <w:szCs w:val="20"/>
+                <w:lang w:val="pt-BR"/>
+              </w:rPr>
+              <w:t>Atribui cada decisão à versão da base que a produziu. É a condição para reproduzir qualquer resultado após uma alteração de regras</w:t>
+            </w:r>
+          </w:p>
+        </w:tc>
+      </w:tr>
+      <w:tr>
+        <w:tc>
+          <w:tcPr>
+            <w:tcW w:w="2100" w:type="dxa"/>
+            <w:tcMar>
+              <w:top w:w="70" w:type="dxa"/>
+              <w:left w:w="90" w:type="dxa"/>
+              <w:bottom w:w="70" w:type="dxa"/>
+              <w:right w:w="90" w:type="dxa"/>
+            </w:tcMar>
+          </w:tcPr>
+          <w:p>
+            <w:r>
+              <w:rPr>
+                <w:sz w:val="20"/>
+                <w:szCs w:val="20"/>
+              </w:rPr>
               <w:t>decisao</w:t>
             </w:r>
           </w:p>
@@ -19051,8 +20509,28 @@
                 <w:szCs w:val="20"/>
                 <w:lang w:val="pt-BR"/>
               </w:rPr>
-              <w:t xml:space="preserve">Carimbo de tempo; ponto de luz; nível pretendido pela inferência; nível emitido; restrição que motivou a correção — nenhuma, piso ou taxa; versão da base de regras; versão do modelo de previsão; classe vigente; previsão de movimentação; nível anterior; instante de publicação; execução de cenário</w:t>
-            </w:r>
+              <w:t xml:space="preserve">Carimbo de tempo; ponto de luz; nível pretendido pela inferência; nível emitido; restrição que motivou a correção — nenhuma, piso ou taxa; versão da base de regras; versão do modelo de previsão; classe vigente; previsão de movimentação; nível anterior; </w:t>
+            </w:r>
+            <w:del w:id="30133" w:author="Vitor Oliveira" w:date="2026-09-28T12:00:00Z">
+              <w:r>
+                <w:rPr>
+                  <w:sz w:val="20"/>
+                  <w:szCs w:val="20"/>
+                  <w:lang w:val="pt-BR"/>
+                </w:rPr>
+                <w:delText xml:space="preserve">instante de publicação; execução de cenário</w:delText>
+              </w:r>
+            </w:del>
+            <w:ins w:id="30134" w:author="Vitor Oliveira" w:date="2026-09-28T12:00:00Z">
+              <w:r>
+                <w:rPr>
+                  <w:sz w:val="20"/>
+                  <w:szCs w:val="20"/>
+                  <w:lang w:val="pt-BR"/>
+                </w:rPr>
+                <w:t xml:space="preserve">instante de publicação; execução de cenário; entradas da inferência e grau de ativação de cada regra</w:t>
+              </w:r>
+            </w:ins>
           </w:p>
         </w:tc>
         <w:tc>
@@ -19987,13 +21465,33 @@
             </w:tcMar>
           </w:tcPr>
           <w:p>
-            <w:r>
-              <w:rPr>
-                <w:sz w:val="20"/>
-                <w:szCs w:val="20"/>
-                <w:lang w:val="pt-BR"/>
-              </w:rPr>
-              <w:t>Identificador; código único; logradouro; coordenadas; classe, chave estrangeira; estado operacional em {operante, falha, manutenção, sem comunicação}; potência plena do segmento, positiva</w:t>
+            <w:del w:id="30149" w:author="Vitor Oliveira" w:date="2026-09-28T12:00:00Z">
+              <w:r>
+                <w:rPr>
+                  <w:sz w:val="20"/>
+                  <w:szCs w:val="20"/>
+                  <w:lang w:val="pt-BR"/>
+                </w:rPr>
+                <w:delText xml:space="preserve">Identificador; código único; logradouro; coordenadas;</w:delText>
+              </w:r>
+            </w:del>
+            <w:ins w:id="30150" w:author="Vitor Oliveira" w:date="2026-09-28T12:00:00Z">
+              <w:r>
+                <w:rPr>
+                  <w:sz w:val="20"/>
+                  <w:szCs w:val="20"/>
+                  <w:lang w:val="pt-BR"/>
+                </w:rPr>
+                <w:t xml:space="preserve">Identificador; código único; placa do cadastro, única; logradouro; coordenadas geográficas e planas;</w:t>
+              </w:r>
+            </w:ins>
+            <w:r>
+              <w:rPr>
+                <w:sz w:val="20"/>
+                <w:szCs w:val="20"/>
+                <w:lang w:val="pt-BR"/>
+              </w:rPr>
+              <w:t xml:space="preserve"> classe, chave estrangeira; estado operacional em {operante, falha, manutenção, sem comunicação}; potência plena do segmento, positiva</w:t>
             </w:r>
           </w:p>
         </w:tc>
@@ -20020,6 +21518,9 @@
         </w:tc>
       </w:tr>
       <w:tr>
+        <w:trPr>
+          <w:ins w:id="30151" w:author="Vitor Oliveira" w:date="2026-09-28T12:00:00Z"/>
+        </w:trPr>
         <w:tc>
           <w:tcPr>
             <w:tcW w:w="2100" w:type="dxa"/>
@@ -20031,13 +21532,20 @@
             </w:tcMar>
           </w:tcPr>
           <w:p>
-            <w:r>
-              <w:rPr>
-                <w:sz w:val="20"/>
-                <w:szCs w:val="20"/>
-              </w:rPr>
-              <w:t>luminaria_referencia</w:t>
-            </w:r>
+            <w:pPr>
+              <w:rPr>
+                <w:ins w:id="30152" w:author="Vitor Oliveira" w:date="2026-09-28T12:00:00Z"/>
+              </w:rPr>
+            </w:pPr>
+            <w:ins w:id="30153" w:author="Vitor Oliveira" w:date="2026-09-28T12:00:00Z">
+              <w:r>
+                <w:rPr>
+                  <w:sz w:val="20"/>
+                  <w:szCs w:val="20"/>
+                </w:rPr>
+                <w:t xml:space="preserve">trecho_via</w:t>
+              </w:r>
+            </w:ins>
           </w:p>
         </w:tc>
         <w:tc>
@@ -20051,14 +21559,21 @@
             </w:tcMar>
           </w:tcPr>
           <w:p>
-            <w:r>
-              <w:rPr>
-                <w:sz w:val="20"/>
-                <w:szCs w:val="20"/>
-                <w:lang w:val="pt-BR"/>
-              </w:rPr>
-              <w:t>Código (chave); potência nominal e eficácia, positivas; interface de dimerização; origem</w:t>
-            </w:r>
+            <w:pPr>
+              <w:rPr>
+                <w:ins w:id="30154" w:author="Vitor Oliveira" w:date="2026-09-28T12:00:00Z"/>
+              </w:rPr>
+            </w:pPr>
+            <w:ins w:id="30155" w:author="Vitor Oliveira" w:date="2026-09-28T12:00:00Z">
+              <w:r>
+                <w:rPr>
+                  <w:sz w:val="20"/>
+                  <w:szCs w:val="20"/>
+                  <w:lang w:val="pt-BR"/>
+                </w:rPr>
+                <w:t xml:space="preserve">Código do segmento no cadastro municipal (chave); código, tipo e nome do logradouro; numeração inicial e final; geometria em coordenadas planas; fonte e data de extração; referência de pessoas, positiva</w:t>
+              </w:r>
+            </w:ins>
           </w:p>
         </w:tc>
         <w:tc>
@@ -20072,18 +21587,29 @@
             </w:tcMar>
           </w:tcPr>
           <w:p>
-            <w:r>
-              <w:rPr>
-                <w:sz w:val="20"/>
-                <w:szCs w:val="20"/>
-                <w:lang w:val="pt-BR"/>
-              </w:rPr>
-              <w:t>Luminárias de 40 W e 440 W do Quadro 9, lidas pela estimativa de energia</w:t>
-            </w:r>
+            <w:pPr>
+              <w:rPr>
+                <w:ins w:id="30156" w:author="Vitor Oliveira" w:date="2026-09-28T12:00:00Z"/>
+              </w:rPr>
+            </w:pPr>
+            <w:ins w:id="30157" w:author="Vitor Oliveira" w:date="2026-09-28T12:00:00Z">
+              <w:r>
+                <w:rPr>
+                  <w:sz w:val="20"/>
+                  <w:szCs w:val="20"/>
+                  <w:lang w:val="pt-BR"/>
+                </w:rPr>
+                <w:t xml:space="preserve">Lugar a que cada leitura se refere; carga inicial com o recorte real do cadastro</w:t>
+              </w:r>
+            </w:ins>
           </w:p>
         </w:tc>
       </w:tr>
       <w:tr>
+        <w:trPr>
+          <w:ins w:id="30151" w:author="Vitor Oliveira" w:date="2026-09-28T12:00:00Z"/>
+          <w:ins w:id="30158" w:author="Vitor Oliveira" w:date="2026-09-28T12:00:00Z"/>
+        </w:trPr>
         <w:tc>
           <w:tcPr>
             <w:tcW w:w="2100" w:type="dxa"/>
@@ -20095,13 +21621,20 @@
             </w:tcMar>
           </w:tcPr>
           <w:p>
-            <w:r>
-              <w:rPr>
-                <w:sz w:val="20"/>
-                <w:szCs w:val="20"/>
-              </w:rPr>
-              <w:t>evento_urbano</w:t>
-            </w:r>
+            <w:pPr>
+              <w:rPr>
+                <w:ins w:id="30159" w:author="Vitor Oliveira" w:date="2026-09-28T12:00:00Z"/>
+              </w:rPr>
+            </w:pPr>
+            <w:ins w:id="30160" w:author="Vitor Oliveira" w:date="2026-09-28T12:00:00Z">
+              <w:r>
+                <w:rPr>
+                  <w:sz w:val="20"/>
+                  <w:szCs w:val="20"/>
+                </w:rPr>
+                <w:t xml:space="preserve">trecho_ponto</w:t>
+              </w:r>
+            </w:ins>
           </w:p>
         </w:tc>
         <w:tc>
@@ -20115,14 +21648,21 @@
             </w:tcMar>
           </w:tcPr>
           <w:p>
-            <w:r>
-              <w:rPr>
-                <w:sz w:val="20"/>
-                <w:szCs w:val="20"/>
-                <w:lang w:val="pt-BR"/>
-              </w:rPr>
-              <w:t>Identificador; instantes de ocorrência e de recebimento; tipo em {movimentação, ocorrência}; valor; rótulo; abrangência em {via, quadra, bairro, município}; origem; vigência não anterior à ocorrência</w:t>
-            </w:r>
+            <w:pPr>
+              <w:rPr>
+                <w:ins w:id="30161" w:author="Vitor Oliveira" w:date="2026-09-28T12:00:00Z"/>
+              </w:rPr>
+            </w:pPr>
+            <w:ins w:id="30162" w:author="Vitor Oliveira" w:date="2026-09-28T12:00:00Z">
+              <w:r>
+                <w:rPr>
+                  <w:sz w:val="20"/>
+                  <w:szCs w:val="20"/>
+                  <w:lang w:val="pt-BR"/>
+                </w:rPr>
+                <w:t xml:space="preserve">Trecho e ponto de luz, chave composta e chaves estrangeiras; distância, não negativa; critério; instante da associação</w:t>
+              </w:r>
+            </w:ins>
           </w:p>
         </w:tc>
         <w:tc>
@@ -20136,14 +21676,21 @@
             </w:tcMar>
           </w:tcPr>
           <w:p>
-            <w:r>
-              <w:rPr>
-                <w:sz w:val="20"/>
-                <w:szCs w:val="20"/>
-                <w:lang w:val="pt-BR"/>
-              </w:rPr>
-              <w:t>Estado da via publicado pela interface; cada inserção notifica o serviço de decisão, que decide na hora (RNF03)</w:t>
-            </w:r>
+            <w:pPr>
+              <w:rPr>
+                <w:ins w:id="30163" w:author="Vitor Oliveira" w:date="2026-09-28T12:00:00Z"/>
+              </w:rPr>
+            </w:pPr>
+            <w:ins w:id="30164" w:author="Vitor Oliveira" w:date="2026-09-28T12:00:00Z">
+              <w:r>
+                <w:rPr>
+                  <w:sz w:val="20"/>
+                  <w:szCs w:val="20"/>
+                  <w:lang w:val="pt-BR"/>
+                </w:rPr>
+                <w:t xml:space="preserve">Pontos de luz afetados por uma leitura e trechos que cada ponto enxerga</w:t>
+              </w:r>
+            </w:ins>
           </w:p>
         </w:tc>
       </w:tr>
@@ -20164,7 +21711,7 @@
                 <w:sz w:val="20"/>
                 <w:szCs w:val="20"/>
               </w:rPr>
-              <w:t>versao_base_regras</w:t>
+              <w:t>luminaria_referencia</w:t>
             </w:r>
           </w:p>
         </w:tc>
@@ -20185,7 +21732,7 @@
                 <w:szCs w:val="20"/>
                 <w:lang w:val="pt-BR"/>
               </w:rPr>
-              <w:t>Identificador; rótulo único; vigência; quantidade de regras, positiva; resumo; hash do arquivo de regras</w:t>
+              <w:t>Código (chave); potência nominal e eficácia, positivas; interface de dimerização; origem</w:t>
             </w:r>
           </w:p>
         </w:tc>
@@ -20206,7 +21753,7 @@
                 <w:szCs w:val="20"/>
                 <w:lang w:val="pt-BR"/>
               </w:rPr>
-              <w:t>O serviço confere o hash ao iniciar e recusa operar com arquivo alterado sem nova versão (RNF04)</w:t>
+              <w:t>Luminárias de 40 W e 440 W do Quadro 9, lidas pela estimativa de energia</w:t>
             </w:r>
           </w:p>
         </w:tc>
@@ -20228,7 +21775,7 @@
                 <w:sz w:val="20"/>
                 <w:szCs w:val="20"/>
               </w:rPr>
-              <w:t>versao_modelo_previsao</w:t>
+              <w:t>evento_urbano</w:t>
             </w:r>
           </w:p>
         </w:tc>
@@ -20249,7 +21796,35 @@
                 <w:szCs w:val="20"/>
                 <w:lang w:val="pt-BR"/>
               </w:rPr>
-              <w:t>Identificador; rótulo único; algoritmo em {persistência, média sazonal, XGBoost}; data de extração da série; data de treino; erros; hash</w:t>
+              <w:t xml:space="preserve">Identificador; instantes de ocorrência e de recebimento; </w:t>
+            </w:r>
+            <w:del w:id="30165" w:author="Vitor Oliveira" w:date="2026-09-28T12:00:00Z">
+              <w:r>
+                <w:rPr>
+                  <w:sz w:val="20"/>
+                  <w:szCs w:val="20"/>
+                  <w:lang w:val="pt-BR"/>
+                </w:rPr>
+                <w:delText xml:space="preserve">tipo em {movimentação, ocorrência}; valor; rótulo; abrangência em {via, quadra, bairro, município}; origem;</w:delText>
+              </w:r>
+            </w:del>
+            <w:ins w:id="30166" w:author="Vitor Oliveira" w:date="2026-09-28T12:00:00Z">
+              <w:r>
+                <w:rPr>
+                  <w:sz w:val="20"/>
+                  <w:szCs w:val="20"/>
+                  <w:lang w:val="pt-BR"/>
+                </w:rPr>
+                <w:t xml:space="preserve">tipo em {leitura}; número de pessoas, inteiro não negativo; ocorrência em {segurança, trânsito}, nula quando não há; abrangência em {via, quadra, bairro, município}; origem; trecho, chave estrangeira obrigatória;</w:t>
+              </w:r>
+            </w:ins>
+            <w:r>
+              <w:rPr>
+                <w:sz w:val="20"/>
+                <w:szCs w:val="20"/>
+                <w:lang w:val="pt-BR"/>
+              </w:rPr>
+              <w:t xml:space="preserve"> vigência não anterior à ocorrência</w:t>
             </w:r>
           </w:p>
         </w:tc>
@@ -20264,13 +21839,33 @@
             </w:tcMar>
           </w:tcPr>
           <w:p>
-            <w:r>
-              <w:rPr>
-                <w:sz w:val="20"/>
-                <w:szCs w:val="20"/>
-                <w:lang w:val="pt-BR"/>
-              </w:rPr>
-              <w:t>Versão da previsão que alimentou cada decisão (RNF04)</w:t>
+            <w:del w:id="30167" w:author="Vitor Oliveira" w:date="2026-09-28T12:00:00Z">
+              <w:r>
+                <w:rPr>
+                  <w:sz w:val="20"/>
+                  <w:szCs w:val="20"/>
+                  <w:lang w:val="pt-BR"/>
+                </w:rPr>
+                <w:delText xml:space="preserve">Estado da via publicado pela interface;</w:delText>
+              </w:r>
+            </w:del>
+            <w:ins w:id="30168" w:author="Vitor Oliveira" w:date="2026-09-28T12:00:00Z">
+              <w:r>
+                <w:rPr>
+                  <w:sz w:val="20"/>
+                  <w:szCs w:val="20"/>
+                  <w:lang w:val="pt-BR"/>
+                </w:rPr>
+                <w:t xml:space="preserve">Leitura do trecho publicada pela interface;</w:t>
+              </w:r>
+            </w:ins>
+            <w:r>
+              <w:rPr>
+                <w:sz w:val="20"/>
+                <w:szCs w:val="20"/>
+                <w:lang w:val="pt-BR"/>
+              </w:rPr>
+              <w:t xml:space="preserve"> cada inserção notifica o serviço de decisão, que decide na hora (RNF03)</w:t>
             </w:r>
           </w:p>
         </w:tc>
@@ -20292,7 +21887,7 @@
                 <w:sz w:val="20"/>
                 <w:szCs w:val="20"/>
               </w:rPr>
-              <w:t>execucao_cenario</w:t>
+              <w:t>versao_base_regras</w:t>
             </w:r>
           </w:p>
         </w:tc>
@@ -20313,7 +21908,7 @@
                 <w:szCs w:val="20"/>
                 <w:lang w:val="pt-BR"/>
               </w:rPr>
-              <w:t>Identificador; cenário; regime em {adaptativo, pleno constante, horário fixo}; modo em {antecipado, reativo}; início e fim, fim não anterior ao início; observação</w:t>
+              <w:t>Identificador; rótulo único; vigência; quantidade de regras, positiva; resumo; hash do arquivo de regras</w:t>
             </w:r>
           </w:p>
         </w:tc>
@@ -20334,7 +21929,7 @@
                 <w:szCs w:val="20"/>
                 <w:lang w:val="pt-BR"/>
               </w:rPr>
-              <w:t>Separa as execuções da suíte (RF10) e os modos comparados para H3</w:t>
+              <w:t>O serviço confere o hash ao iniciar e recusa operar com arquivo alterado sem nova versão (RNF04)</w:t>
             </w:r>
           </w:p>
         </w:tc>
@@ -20356,6 +21951,134 @@
                 <w:sz w:val="20"/>
                 <w:szCs w:val="20"/>
               </w:rPr>
+              <w:t>versao_modelo_previsao</w:t>
+            </w:r>
+          </w:p>
+        </w:tc>
+        <w:tc>
+          <w:tcPr>
+            <w:tcW w:w="3200" w:type="dxa"/>
+            <w:tcMar>
+              <w:top w:w="70" w:type="dxa"/>
+              <w:left w:w="90" w:type="dxa"/>
+              <w:bottom w:w="70" w:type="dxa"/>
+              <w:right w:w="90" w:type="dxa"/>
+            </w:tcMar>
+          </w:tcPr>
+          <w:p>
+            <w:r>
+              <w:rPr>
+                <w:sz w:val="20"/>
+                <w:szCs w:val="20"/>
+                <w:lang w:val="pt-BR"/>
+              </w:rPr>
+              <w:t>Identificador; rótulo único; algoritmo em {persistência, média sazonal, XGBoost}; data de extração da série; data de treino; erros; hash</w:t>
+            </w:r>
+          </w:p>
+        </w:tc>
+        <w:tc>
+          <w:tcPr>
+            <w:tcW w:w="3771" w:type="dxa"/>
+            <w:tcMar>
+              <w:top w:w="70" w:type="dxa"/>
+              <w:left w:w="90" w:type="dxa"/>
+              <w:bottom w:w="70" w:type="dxa"/>
+              <w:right w:w="90" w:type="dxa"/>
+            </w:tcMar>
+          </w:tcPr>
+          <w:p>
+            <w:r>
+              <w:rPr>
+                <w:sz w:val="20"/>
+                <w:szCs w:val="20"/>
+                <w:lang w:val="pt-BR"/>
+              </w:rPr>
+              <w:t>Versão da previsão que alimentou cada decisão (RNF04)</w:t>
+            </w:r>
+          </w:p>
+        </w:tc>
+      </w:tr>
+      <w:tr>
+        <w:tc>
+          <w:tcPr>
+            <w:tcW w:w="2100" w:type="dxa"/>
+            <w:tcMar>
+              <w:top w:w="70" w:type="dxa"/>
+              <w:left w:w="90" w:type="dxa"/>
+              <w:bottom w:w="70" w:type="dxa"/>
+              <w:right w:w="90" w:type="dxa"/>
+            </w:tcMar>
+          </w:tcPr>
+          <w:p>
+            <w:r>
+              <w:rPr>
+                <w:sz w:val="20"/>
+                <w:szCs w:val="20"/>
+              </w:rPr>
+              <w:t>execucao_cenario</w:t>
+            </w:r>
+          </w:p>
+        </w:tc>
+        <w:tc>
+          <w:tcPr>
+            <w:tcW w:w="3200" w:type="dxa"/>
+            <w:tcMar>
+              <w:top w:w="70" w:type="dxa"/>
+              <w:left w:w="90" w:type="dxa"/>
+              <w:bottom w:w="70" w:type="dxa"/>
+              <w:right w:w="90" w:type="dxa"/>
+            </w:tcMar>
+          </w:tcPr>
+          <w:p>
+            <w:r>
+              <w:rPr>
+                <w:sz w:val="20"/>
+                <w:szCs w:val="20"/>
+                <w:lang w:val="pt-BR"/>
+              </w:rPr>
+              <w:t>Identificador; cenário; regime em {adaptativo, pleno constante, horário fixo}; modo em {antecipado, reativo}; início e fim, fim não anterior ao início; observação</w:t>
+            </w:r>
+          </w:p>
+        </w:tc>
+        <w:tc>
+          <w:tcPr>
+            <w:tcW w:w="3771" w:type="dxa"/>
+            <w:tcMar>
+              <w:top w:w="70" w:type="dxa"/>
+              <w:left w:w="90" w:type="dxa"/>
+              <w:bottom w:w="70" w:type="dxa"/>
+              <w:right w:w="90" w:type="dxa"/>
+            </w:tcMar>
+          </w:tcPr>
+          <w:p>
+            <w:r>
+              <w:rPr>
+                <w:sz w:val="20"/>
+                <w:szCs w:val="20"/>
+                <w:lang w:val="pt-BR"/>
+              </w:rPr>
+              <w:t>Separa as execuções da suíte (RF10) e os modos comparados para H3</w:t>
+            </w:r>
+          </w:p>
+        </w:tc>
+      </w:tr>
+      <w:tr>
+        <w:tc>
+          <w:tcPr>
+            <w:tcW w:w="2100" w:type="dxa"/>
+            <w:tcMar>
+              <w:top w:w="70" w:type="dxa"/>
+              <w:left w:w="90" w:type="dxa"/>
+              <w:bottom w:w="70" w:type="dxa"/>
+              <w:right w:w="90" w:type="dxa"/>
+            </w:tcMar>
+          </w:tcPr>
+          <w:p>
+            <w:r>
+              <w:rPr>
+                <w:sz w:val="20"/>
+                <w:szCs w:val="20"/>
+              </w:rPr>
               <w:t>decisao</w:t>
             </w:r>
           </w:p>
@@ -20377,8 +22100,28 @@
                 <w:szCs w:val="20"/>
                 <w:lang w:val="pt-BR"/>
               </w:rPr>
-              <w:t>Identificador universal único; instante; ponto, versões da base e do modelo, execução e classe vigente, chaves estrangeiras; previsão; níveis pretendido, emitido e anterior; restrição em {nenhuma, piso, taxa}, nenhuma se e somente se o emitido for igual ao pretendido; instante de publicação</w:t>
-            </w:r>
+              <w:t xml:space="preserve">Identificador universal único; instante; ponto, versões da base e do modelo, execução e classe vigente, chaves estrangeiras; previsão; níveis pretendido, emitido e anterior; restrição em {nenhuma, piso, taxa}, nenhuma se e somente se o emitido for igual ao pretendido</w:t>
+            </w:r>
+            <w:del w:id="30169" w:author="Vitor Oliveira" w:date="2026-09-28T12:00:00Z">
+              <w:r>
+                <w:rPr>
+                  <w:sz w:val="20"/>
+                  <w:szCs w:val="20"/>
+                  <w:lang w:val="pt-BR"/>
+                </w:rPr>
+                <w:delText xml:space="preserve">; instante de publicação</w:delText>
+              </w:r>
+            </w:del>
+            <w:ins w:id="30170" w:author="Vitor Oliveira" w:date="2026-09-28T12:00:00Z">
+              <w:r>
+                <w:rPr>
+                  <w:sz w:val="20"/>
+                  <w:szCs w:val="20"/>
+                  <w:lang w:val="pt-BR"/>
+                </w:rPr>
+                <w:t xml:space="preserve">; instante de publicação; entradas da inferência e ativações das regras, em JSON</w:t>
+              </w:r>
+            </w:ins>
           </w:p>
         </w:tc>
         <w:tc>
@@ -20964,13 +22707,24 @@
             </w:tcMar>
           </w:tcPr>
           <w:p>
-            <w:r>
-              <w:rPr>
-                <w:sz w:val="20"/>
-                <w:szCs w:val="20"/>
-              </w:rPr>
-              <w:t>Evento com campo fora do contrato, tipo desconhecido ou valor fora de 0 a 1</w:t>
-            </w:r>
+            <w:del w:id="30171" w:author="Vitor Oliveira" w:date="2026-09-28T12:00:00Z">
+              <w:r>
+                <w:rPr>
+                  <w:sz w:val="20"/>
+                  <w:szCs w:val="20"/>
+                </w:rPr>
+                <w:delText>Evento com campo fora do contrato, tipo desconhecido ou valor fora de 0 a 1</w:delText>
+              </w:r>
+            </w:del>
+            <w:ins w:id="30172" w:author="Vitor Oliveira" w:date="2026-09-28T12:00:00Z">
+              <w:r>
+                <w:rPr>
+                  <w:sz w:val="20"/>
+                  <w:szCs w:val="20"/>
+                </w:rPr>
+                <w:t xml:space="preserve">Leitura com campo fora do contrato, número de pessoas negativo, trecho fora do cadastro ou sem chave de acesso</w:t>
+              </w:r>
+            </w:ins>
           </w:p>
         </w:tc>
         <w:tc>
@@ -20984,14 +22738,26 @@
             </w:tcMar>
           </w:tcPr>
           <w:p>
-            <w:r>
-              <w:rPr>
-                <w:sz w:val="20"/>
-                <w:szCs w:val="20"/>
-                <w:lang w:val="pt-BR"/>
-              </w:rPr>
-              <w:t>Recusa com erro de validação; nada é gravado</w:t>
-            </w:r>
+            <w:del w:id="30173" w:author="Vitor Oliveira" w:date="2026-09-28T12:00:00Z">
+              <w:r>
+                <w:rPr>
+                  <w:sz w:val="20"/>
+                  <w:szCs w:val="20"/>
+                  <w:lang w:val="pt-BR"/>
+                </w:rPr>
+                <w:delText>Recusa com erro de validação; nada é gravado</w:delText>
+              </w:r>
+            </w:del>
+            <w:ins w:id="30174" w:author="Vitor Oliveira" w:date="2026-09-28T12:00:00Z">
+              <w:r>
+                <w:rPr>
+                  <w:sz w:val="20"/>
+                  <w:szCs w:val="20"/>
+                  <w:lang w:val="pt-BR"/>
+                </w:rPr>
+                <w:t xml:space="preserve">Recusa com erro de validação ou de autenticação; nada é gravado</w:t>
+              </w:r>
+            </w:ins>
           </w:p>
         </w:tc>
       </w:tr>
@@ -21048,13 +22814,24 @@
             </w:tcMar>
           </w:tcPr>
           <w:p>
-            <w:r>
-              <w:rPr>
-                <w:sz w:val="20"/>
-                <w:szCs w:val="20"/>
-              </w:rPr>
-              <w:t>Histórico horário de movimentação; histórico incompleto</w:t>
-            </w:r>
+            <w:del w:id="30175" w:author="Vitor Oliveira" w:date="2026-09-28T12:00:00Z">
+              <w:r>
+                <w:rPr>
+                  <w:sz w:val="20"/>
+                  <w:szCs w:val="20"/>
+                </w:rPr>
+                <w:delText>Histórico horário de movimentação; histórico incompleto</w:delText>
+              </w:r>
+            </w:del>
+            <w:ins w:id="30176" w:author="Vitor Oliveira" w:date="2026-09-28T12:00:00Z">
+              <w:r>
+                <w:rPr>
+                  <w:sz w:val="20"/>
+                  <w:szCs w:val="20"/>
+                </w:rPr>
+                <w:t xml:space="preserve">Histórico de leituras do trecho; histórico incompleto</w:t>
+              </w:r>
+            </w:ins>
           </w:p>
         </w:tc>
         <w:tc>
@@ -21152,14 +22929,26 @@
             </w:tcMar>
           </w:tcPr>
           <w:p>
-            <w:r>
-              <w:rPr>
-                <w:sz w:val="20"/>
-                <w:szCs w:val="20"/>
-                <w:lang w:val="pt-BR"/>
-              </w:rPr>
-              <w:t>Oito regras, todas com origem declarada e legíveis em linguagem natural; sempre ao menos uma regra ativa</w:t>
-            </w:r>
+            <w:del w:id="30177" w:author="Vitor Oliveira" w:date="2026-09-28T12:00:00Z">
+              <w:r>
+                <w:rPr>
+                  <w:sz w:val="20"/>
+                  <w:szCs w:val="20"/>
+                  <w:lang w:val="pt-BR"/>
+                </w:rPr>
+                <w:delText>Oito regras, todas com origem declarada e legíveis em linguagem natural; sempre ao menos uma regra ativa</w:delText>
+              </w:r>
+            </w:del>
+            <w:ins w:id="30178" w:author="Vitor Oliveira" w:date="2026-09-28T12:00:00Z">
+              <w:r>
+                <w:rPr>
+                  <w:sz w:val="20"/>
+                  <w:szCs w:val="20"/>
+                  <w:lang w:val="pt-BR"/>
+                </w:rPr>
+                <w:t xml:space="preserve">Seis regras, todas com origem declarada e legíveis em linguagem natural; nenhuma regra de atenuação sem via vazia e sem ausência de ocorrência</w:t>
+              </w:r>
+            </w:ins>
           </w:p>
         </w:tc>
       </w:tr>
@@ -21216,13 +23005,24 @@
             </w:tcMar>
           </w:tcPr>
           <w:p>
-            <w:r>
-              <w:rPr>
-                <w:sz w:val="20"/>
-                <w:szCs w:val="20"/>
-              </w:rPr>
-              <w:t>Ocorrência reportada com movimentação baixa, na madrugada e no início da noite</w:t>
-            </w:r>
+            <w:del w:id="30179" w:author="Vitor Oliveira" w:date="2026-09-28T12:00:00Z">
+              <w:r>
+                <w:rPr>
+                  <w:sz w:val="20"/>
+                  <w:szCs w:val="20"/>
+                </w:rPr>
+                <w:delText>Ocorrência reportada com movimentação baixa, na madrugada e no início da noite</w:delText>
+              </w:r>
+            </w:del>
+            <w:ins w:id="30180" w:author="Vitor Oliveira" w:date="2026-09-28T12:00:00Z">
+              <w:r>
+                <w:rPr>
+                  <w:sz w:val="20"/>
+                  <w:szCs w:val="20"/>
+                </w:rPr>
+                <w:t xml:space="preserve">Ocorrência reportada, ou um único pedestre no trecho, com previsão baixa, na madrugada e no início da noite</w:t>
+              </w:r>
+            </w:ins>
           </w:p>
         </w:tc>
         <w:tc>
@@ -21236,14 +23036,26 @@
             </w:tcMar>
           </w:tcPr>
           <w:p>
-            <w:r>
-              <w:rPr>
-                <w:sz w:val="20"/>
-                <w:szCs w:val="20"/>
-                <w:lang w:val="pt-BR"/>
-              </w:rPr>
-              <w:t>Nível pretendido acima de 0,9: a evidência de risco não é diluída</w:t>
-            </w:r>
+            <w:del w:id="30181" w:author="Vitor Oliveira" w:date="2026-09-28T12:00:00Z">
+              <w:r>
+                <w:rPr>
+                  <w:sz w:val="20"/>
+                  <w:szCs w:val="20"/>
+                  <w:lang w:val="pt-BR"/>
+                </w:rPr>
+                <w:delText>Nível pretendido acima de 0,9: a evidência de risco não é diluída</w:delText>
+              </w:r>
+            </w:del>
+            <w:ins w:id="30182" w:author="Vitor Oliveira" w:date="2026-09-28T12:00:00Z">
+              <w:r>
+                <w:rPr>
+                  <w:sz w:val="20"/>
+                  <w:szCs w:val="20"/>
+                  <w:lang w:val="pt-BR"/>
+                </w:rPr>
+                <w:t xml:space="preserve">Nível pretendido acima de 0,9: a evidência de risco ou de pedestre não é diluída</w:t>
+              </w:r>
+            </w:ins>
           </w:p>
         </w:tc>
       </w:tr>
@@ -21384,13 +23196,24 @@
             </w:tcMar>
           </w:tcPr>
           <w:p>
-            <w:r>
-              <w:rPr>
-                <w:sz w:val="20"/>
-                <w:szCs w:val="20"/>
-              </w:rPr>
-              <w:t>Movimentação baixa a partir do pleno</w:t>
-            </w:r>
+            <w:del w:id="30183" w:author="Vitor Oliveira" w:date="2026-09-28T12:00:00Z">
+              <w:r>
+                <w:rPr>
+                  <w:sz w:val="20"/>
+                  <w:szCs w:val="20"/>
+                </w:rPr>
+                <w:delText>Movimentação baixa a partir do pleno</w:delText>
+              </w:r>
+            </w:del>
+            <w:ins w:id="30184" w:author="Vitor Oliveira" w:date="2026-09-28T12:00:00Z">
+              <w:r>
+                <w:rPr>
+                  <w:sz w:val="20"/>
+                  <w:szCs w:val="20"/>
+                </w:rPr>
+                <w:t xml:space="preserve">Via vazia com previsão baixa, a partir do pleno</w:t>
+              </w:r>
+            </w:ins>
           </w:p>
         </w:tc>
         <w:tc>
@@ -22056,13 +23879,24 @@
             </w:tcMar>
           </w:tcPr>
           <w:p>
-            <w:r>
-              <w:rPr>
-                <w:sz w:val="20"/>
-                <w:szCs w:val="20"/>
-              </w:rPr>
-              <w:t>Consultas de decisões, pontos, alertas e energia</w:t>
-            </w:r>
+            <w:del w:id="30185" w:author="Vitor Oliveira" w:date="2026-09-28T12:00:00Z">
+              <w:r>
+                <w:rPr>
+                  <w:sz w:val="20"/>
+                  <w:szCs w:val="20"/>
+                </w:rPr>
+                <w:delText>Consultas de decisões, pontos, alertas e energia</w:delText>
+              </w:r>
+            </w:del>
+            <w:ins w:id="30186" w:author="Vitor Oliveira" w:date="2026-09-28T12:00:00Z">
+              <w:r>
+                <w:rPr>
+                  <w:sz w:val="20"/>
+                  <w:szCs w:val="20"/>
+                </w:rPr>
+                <w:t xml:space="preserve">Consultas de decisões, pontos, trechos, alertas, energia e explicação de uma leitura</w:t>
+              </w:r>
+            </w:ins>
           </w:p>
         </w:tc>
         <w:tc>
@@ -22076,13 +23910,33 @@
             </w:tcMar>
           </w:tcPr>
           <w:p>
-            <w:r>
-              <w:rPr>
-                <w:sz w:val="20"/>
-                <w:szCs w:val="20"/>
-                <w:lang w:val="pt-BR"/>
-              </w:rPr>
-              <w:t>Cadeia de auditoria, estado do ponto e alertas abertos; cabeçalhos para a origem do painel</w:t>
+            <w:del w:id="30187" w:author="Vitor Oliveira" w:date="2026-09-28T12:00:00Z">
+              <w:r>
+                <w:rPr>
+                  <w:sz w:val="20"/>
+                  <w:szCs w:val="20"/>
+                  <w:lang w:val="pt-BR"/>
+                </w:rPr>
+                <w:delText xml:space="preserve">Cadeia de auditoria, estado do ponto e alertas abertos;</w:delText>
+              </w:r>
+            </w:del>
+            <w:ins w:id="30188" w:author="Vitor Oliveira" w:date="2026-09-28T12:00:00Z">
+              <w:r>
+                <w:rPr>
+                  <w:sz w:val="20"/>
+                  <w:szCs w:val="20"/>
+                  <w:lang w:val="pt-BR"/>
+                </w:rPr>
+                <w:t xml:space="preserve">Cadeia de auditoria com as regras ativadas, estado do ponto, trechos associados e alertas abertos;</w:t>
+              </w:r>
+            </w:ins>
+            <w:r>
+              <w:rPr>
+                <w:sz w:val="20"/>
+                <w:szCs w:val="20"/>
+                <w:lang w:val="pt-BR"/>
+              </w:rPr>
+              <w:t xml:space="preserve"> cabeçalhos para a origem do painel</w:t>
             </w:r>
           </w:p>
         </w:tc>
@@ -23318,108 +25172,6 @@
     </w:p>
     <w:p>
       <w:pPr>
-        <w:pStyle w:val="Heading2"/>
-        <w:spacing w:before="360" w:after="240" w:line="360" w:lineRule="auto"/>
-        <w:rPr>
-          <w:lang w:val="pt-BR"/>
-        </w:rPr>
-      </w:pPr>
-      <w:bookmarkStart w:id="67" w:name="_Toc240909257"/>
-      <w:r>
-        <w:rPr>
-          <w:lang w:val="pt-BR"/>
-        </w:rPr>
-        <w:t>6.4 Implicações dos resultados</w:t>
-      </w:r>
-      <w:bookmarkEnd w:id="67"/>
-    </w:p>
-    <w:p>
-      <w:pPr>
-        <w:spacing w:after="120" w:line="360" w:lineRule="auto"/>
-        <w:ind w:firstLine="709"/>
-        <w:jc w:val="both"/>
-        <w:rPr>
-          <w:lang w:val="pt-BR"/>
-        </w:rPr>
-      </w:pPr>
-      <w:r>
-        <w:rPr>
-          <w:highlight w:val="yellow"/>
-          <w:lang w:val="pt-BR"/>
-        </w:rPr>
-        <w:t>[PENDENTE — analisar as implicações dos resultados para a proposta de integração no município (2.3 e 3.3) e o impacto na área.]</w:t>
-      </w:r>
-    </w:p>
-    <w:p>
-      <w:pPr>
-        <w:pStyle w:val="Heading1"/>
-        <w:pageBreakBefore/>
-        <w:spacing w:before="480" w:after="280" w:line="360" w:lineRule="auto"/>
-        <w:rPr>
-          <w:lang w:val="pt-BR"/>
-        </w:rPr>
-      </w:pPr>
-      <w:bookmarkStart w:id="68" w:name="_Toc240909258"/>
-      <w:r>
-        <w:rPr>
-          <w:lang w:val="pt-BR"/>
-        </w:rPr>
-        <w:t>7 CONCLUSÕES</w:t>
-      </w:r>
-      <w:bookmarkEnd w:id="68"/>
-    </w:p>
-    <w:p>
-      <w:pPr>
-        <w:spacing w:after="120" w:line="360" w:lineRule="auto"/>
-        <w:ind w:firstLine="709"/>
-        <w:jc w:val="both"/>
-        <w:rPr>
-          <w:lang w:val="pt-BR"/>
-        </w:rPr>
-      </w:pPr>
-      <w:r>
-        <w:rPr>
-          <w:highlight w:val="yellow"/>
-          <w:lang w:val="pt-BR"/>
-        </w:rPr>
-        <w:t>[PENDENTE — condensar em cinco ou seis sentenças os aspectos-chave do trabalho, sem informação nova, revisitando o objetivo geral (1.5.1) e os objetivos específicos a) a i) (1.5.2) e declarando o grau em que cada um foi atingido.]</w:t>
-      </w:r>
-    </w:p>
-    <w:p>
-      <w:pPr>
-        <w:pStyle w:val="Heading2"/>
-        <w:spacing w:before="360" w:after="240" w:line="360" w:lineRule="auto"/>
-        <w:rPr>
-          <w:lang w:val="pt-BR"/>
-        </w:rPr>
-      </w:pPr>
-      <w:bookmarkStart w:id="69" w:name="_Toc240909259"/>
-      <w:r>
-        <w:rPr>
-          <w:lang w:val="pt-BR"/>
-        </w:rPr>
-        <w:t>7.1 Recomendações</w:t>
-      </w:r>
-      <w:bookmarkEnd w:id="69"/>
-    </w:p>
-    <w:p>
-      <w:pPr>
-        <w:spacing w:after="120" w:line="360" w:lineRule="auto"/>
-        <w:ind w:firstLine="709"/>
-        <w:jc w:val="both"/>
-        <w:rPr>
-          <w:lang w:val="pt-BR"/>
-        </w:rPr>
-      </w:pPr>
-      <w:r>
-        <w:rPr>
-          <w:lang w:val="pt-BR"/>
-        </w:rPr>
-        <w:t>As recomendações a seguir reúnem os desdobramentos registrados ao longo do texto, cada um acompanhado da seção em que foi identificado.</w:t>
-      </w:r>
-    </w:p>
-    <w:p>
-      <w:pPr>
         <w:pStyle w:val="ListParagraph"/>
         <w:numPr>
           <w:ilvl w:val="0"/>
@@ -23428,15 +25180,17 @@
         <w:spacing w:after="120" w:line="360" w:lineRule="auto"/>
         <w:jc w:val="both"/>
         <w:rPr>
-          <w:lang w:val="pt-BR"/>
-        </w:rPr>
-      </w:pPr>
-      <w:r>
-        <w:rPr>
-          <w:lang w:val="pt-BR"/>
-        </w:rPr>
-        <w:t>Tratar o crescimento das entidades de evento urbano e de telemetria em escala de parque, com particionamento por tempo, política de retenção e, armazenamento orientado a série temporal (4.7.1).</w:t>
-      </w:r>
+          <w:ins w:id="30189" w:author="Vitor Oliveira" w:date="2026-09-28T12:00:00Z"/>
+        </w:rPr>
+      </w:pPr>
+      <w:ins w:id="30190" w:author="Vitor Oliveira" w:date="2026-09-28T12:00:00Z">
+        <w:r>
+          <w:rPr>
+            <w:lang w:val="pt-BR"/>
+          </w:rPr>
+          <w:t xml:space="preserve">A associação entre trecho de via e ponto de luz adota raio de 25 m, parâmetro declarado e não derivado de norma. Com os segmentos curtos do cadastro municipal, muitos postes servem a três ou mais trechos, o que é conservador para a segurança e reduz a atenuação; outro raio produziria outra associação.</w:t>
+        </w:r>
+      </w:ins>
     </w:p>
     <w:p>
       <w:pPr>
@@ -23448,15 +25202,17 @@
         <w:spacing w:after="120" w:line="360" w:lineRule="auto"/>
         <w:jc w:val="both"/>
         <w:rPr>
-          <w:lang w:val="pt-BR"/>
-        </w:rPr>
-      </w:pPr>
-      <w:r>
-        <w:rPr>
-          <w:lang w:val="pt-BR"/>
-        </w:rPr>
-        <w:t>Verificar a medição de iluminância contra instrumento de referência calibrado, ou contra segunda cadeia de medição de arquitetura distinta (3.4.4).</w:t>
-      </w:r>
+          <w:ins w:id="30191" w:author="Vitor Oliveira" w:date="2026-09-28T12:00:00Z"/>
+        </w:rPr>
+      </w:pPr>
+      <w:ins w:id="30192" w:author="Vitor Oliveira" w:date="2026-09-28T12:00:00Z">
+        <w:r>
+          <w:rPr>
+            <w:lang w:val="pt-BR"/>
+          </w:rPr>
+          <w:t xml:space="preserve">O cadastro municipal tem ruído — placas duplicadas, postes distantes de qualquer trecho, endereços em texto livre —, e a associação foi verificada sobre um único recorte, de 16 trechos e 36 postes. A qualidade do cadastro em escala de parque não foi avaliada.</w:t>
+        </w:r>
+      </w:ins>
     </w:p>
     <w:p>
       <w:pPr>
@@ -23468,15 +25224,17 @@
         <w:spacing w:after="120" w:line="360" w:lineRule="auto"/>
         <w:jc w:val="both"/>
         <w:rPr>
-          <w:lang w:val="pt-BR"/>
-        </w:rPr>
-      </w:pPr>
-      <w:r>
-        <w:rPr>
-          <w:lang w:val="pt-BR"/>
-        </w:rPr>
-        <w:t>Estender a avaliação ao controle coordenado de múltiplas luminárias em rede (3.4.4 e 6.3).</w:t>
-      </w:r>
+          <w:ins w:id="30193" w:author="Vitor Oliveira" w:date="2026-09-28T12:00:00Z"/>
+        </w:rPr>
+      </w:pPr>
+      <w:ins w:id="30194" w:author="Vitor Oliveira" w:date="2026-09-28T12:00:00Z">
+        <w:r>
+          <w:rPr>
+            <w:lang w:val="pt-BR"/>
+          </w:rPr>
+          <w:t xml:space="preserve">Até acumular sete dias de leituras, a referência que normaliza a série de previsão de cada trecho é um valor inicial arbitrado, de cinco pessoas; nesse período, a previsão opera sobre escala não aprendida.</w:t>
+        </w:r>
+      </w:ins>
     </w:p>
     <w:p>
       <w:pPr>
@@ -23488,14 +25246,118 @@
         <w:spacing w:after="120" w:line="360" w:lineRule="auto"/>
         <w:jc w:val="both"/>
         <w:rPr>
-          <w:lang w:val="pt-BR"/>
-        </w:rPr>
-      </w:pPr>
-      <w:r>
-        <w:rPr>
-          <w:lang w:val="pt-BR"/>
-        </w:rPr>
-        <w:t>Estimar empiricamente a depreciação do fluxo luminoso — o fator de manutenção da ABNT NBR 5101 — a partir da comparação contínua entre nível comandado e iluminância entregue, em operação de milhares de horas (3.4.5).</w:t>
+          <w:ins w:id="30195" w:author="Vitor Oliveira" w:date="2026-09-28T12:00:00Z"/>
+        </w:rPr>
+      </w:pPr>
+      <w:ins w:id="30196" w:author="Vitor Oliveira" w:date="2026-09-28T12:00:00Z">
+        <w:r>
+          <w:rPr>
+            <w:lang w:val="pt-BR"/>
+          </w:rPr>
+          <w:t xml:space="preserve">Na demonstração, a chave com que o painel publica leituras está embutida na aplicação estática e é, portanto, pública: qualquer visitante pode publicar leituras. O pior caso é luz a mais, porque a verificação normativa independe da origem da leitura. A chave é distinta da de integração e é revogada após a defesa.</w:t>
+        </w:r>
+      </w:ins>
+    </w:p>
+    <w:p>
+      <w:pPr>
+        <w:pStyle w:val="Heading2"/>
+        <w:spacing w:before="360" w:after="240" w:line="360" w:lineRule="auto"/>
+        <w:rPr>
+          <w:lang w:val="pt-BR"/>
+        </w:rPr>
+      </w:pPr>
+      <w:bookmarkStart w:id="67" w:name="_Toc240909257"/>
+      <w:r>
+        <w:rPr>
+          <w:lang w:val="pt-BR"/>
+        </w:rPr>
+        <w:t>6.4 Implicações dos resultados</w:t>
+      </w:r>
+      <w:bookmarkEnd w:id="67"/>
+    </w:p>
+    <w:p>
+      <w:pPr>
+        <w:spacing w:after="120" w:line="360" w:lineRule="auto"/>
+        <w:ind w:firstLine="709"/>
+        <w:jc w:val="both"/>
+        <w:rPr>
+          <w:lang w:val="pt-BR"/>
+        </w:rPr>
+      </w:pPr>
+      <w:r>
+        <w:rPr>
+          <w:highlight w:val="yellow"/>
+          <w:lang w:val="pt-BR"/>
+        </w:rPr>
+        <w:t>[PENDENTE — analisar as implicações dos resultados para a proposta de integração no município (2.3 e 3.3) e o impacto na área.]</w:t>
+      </w:r>
+    </w:p>
+    <w:p>
+      <w:pPr>
+        <w:pStyle w:val="Heading1"/>
+        <w:pageBreakBefore/>
+        <w:spacing w:before="480" w:after="280" w:line="360" w:lineRule="auto"/>
+        <w:rPr>
+          <w:lang w:val="pt-BR"/>
+        </w:rPr>
+      </w:pPr>
+      <w:bookmarkStart w:id="68" w:name="_Toc240909258"/>
+      <w:r>
+        <w:rPr>
+          <w:lang w:val="pt-BR"/>
+        </w:rPr>
+        <w:t>7 CONCLUSÕES</w:t>
+      </w:r>
+      <w:bookmarkEnd w:id="68"/>
+    </w:p>
+    <w:p>
+      <w:pPr>
+        <w:spacing w:after="120" w:line="360" w:lineRule="auto"/>
+        <w:ind w:firstLine="709"/>
+        <w:jc w:val="both"/>
+        <w:rPr>
+          <w:lang w:val="pt-BR"/>
+        </w:rPr>
+      </w:pPr>
+      <w:r>
+        <w:rPr>
+          <w:highlight w:val="yellow"/>
+          <w:lang w:val="pt-BR"/>
+        </w:rPr>
+        <w:t>[PENDENTE — condensar em cinco ou seis sentenças os aspectos-chave do trabalho, sem informação nova, revisitando o objetivo geral (1.5.1) e os objetivos específicos a) a i) (1.5.2) e declarando o grau em que cada um foi atingido.]</w:t>
+      </w:r>
+    </w:p>
+    <w:p>
+      <w:pPr>
+        <w:pStyle w:val="Heading2"/>
+        <w:spacing w:before="360" w:after="240" w:line="360" w:lineRule="auto"/>
+        <w:rPr>
+          <w:lang w:val="pt-BR"/>
+        </w:rPr>
+      </w:pPr>
+      <w:bookmarkStart w:id="69" w:name="_Toc240909259"/>
+      <w:r>
+        <w:rPr>
+          <w:lang w:val="pt-BR"/>
+        </w:rPr>
+        <w:t>7.1 Recomendações</w:t>
+      </w:r>
+      <w:bookmarkEnd w:id="69"/>
+    </w:p>
+    <w:p>
+      <w:pPr>
+        <w:spacing w:after="120" w:line="360" w:lineRule="auto"/>
+        <w:ind w:firstLine="709"/>
+        <w:jc w:val="both"/>
+        <w:rPr>
+          <w:lang w:val="pt-BR"/>
+        </w:rPr>
+      </w:pPr>
+      <w:r>
+        <w:rPr>
+          <w:lang w:val="pt-BR"/>
+        </w:rPr>
+        <w:t>As recomendações a seguir reúnem os desdobramentos registrados ao longo do texto, cada um acompanhado da seção em que foi identificado.</w:t>
       </w:r>
     </w:p>
     <w:p>
@@ -23515,7 +25377,7 @@
         <w:rPr>
           <w:lang w:val="pt-BR"/>
         </w:rPr>
-        <w:t>Quantificar o consumo em equipamento viário, com medição elétrica rastreável (3.11 e 6.3).</w:t>
+        <w:t>Tratar o crescimento das entidades de evento urbano e de telemetria em escala de parque, com particionamento por tempo, política de retenção e, armazenamento orientado a série temporal (4.7.1).</w:t>
       </w:r>
     </w:p>
     <w:p>
@@ -23535,7 +25397,7 @@
         <w:rPr>
           <w:lang w:val="pt-BR"/>
         </w:rPr>
-        <w:t>Conduzir campanha de verificação fotométrica sobre ponto de luz efetivamente instalado (6.3).</w:t>
+        <w:t>Verificar a medição de iluminância contra instrumento de referência calibrado, ou contra segunda cadeia de medição de arquitetura distinta (3.4.4).</w:t>
       </w:r>
     </w:p>
     <w:p>
@@ -23555,7 +25417,7 @@
         <w:rPr>
           <w:lang w:val="pt-BR"/>
         </w:rPr>
-        <w:t>Retreinar a camada de previsão sobre série municipal publicada no formato definido pela especificação de interface (3.6).</w:t>
+        <w:t>Estender a avaliação ao controle coordenado de múltiplas luminárias em rede (3.4.4 e 6.3).</w:t>
       </w:r>
     </w:p>
     <w:p>
@@ -23575,7 +25437,7 @@
         <w:rPr>
           <w:lang w:val="pt-BR"/>
         </w:rPr>
-        <w:t>Investigar o ajuste automático da base de regras, por sistemas neuro-nebulosos ou por aprendizado por reforço, enfrentando a circularidade discutida em 2.6 (6.3).</w:t>
+        <w:t>Estimar empiricamente a depreciação do fluxo luminoso — o fator de manutenção da ABNT NBR 5101 — a partir da comparação contínua entre nível comandado e iluminância entregue, em operação de milhares de horas (3.4.5).</w:t>
       </w:r>
     </w:p>
     <w:p>
@@ -23595,6 +25457,86 @@
         <w:rPr>
           <w:lang w:val="pt-BR"/>
         </w:rPr>
+        <w:t>Quantificar o consumo em equipamento viário, com medição elétrica rastreável (3.11 e 6.3).</w:t>
+      </w:r>
+    </w:p>
+    <w:p>
+      <w:pPr>
+        <w:pStyle w:val="ListParagraph"/>
+        <w:numPr>
+          <w:ilvl w:val="0"/>
+          <w:numId w:val="2"/>
+        </w:numPr>
+        <w:spacing w:after="120" w:line="360" w:lineRule="auto"/>
+        <w:jc w:val="both"/>
+        <w:rPr>
+          <w:lang w:val="pt-BR"/>
+        </w:rPr>
+      </w:pPr>
+      <w:r>
+        <w:rPr>
+          <w:lang w:val="pt-BR"/>
+        </w:rPr>
+        <w:t>Conduzir campanha de verificação fotométrica sobre ponto de luz efetivamente instalado (6.3).</w:t>
+      </w:r>
+    </w:p>
+    <w:p>
+      <w:pPr>
+        <w:pStyle w:val="ListParagraph"/>
+        <w:numPr>
+          <w:ilvl w:val="0"/>
+          <w:numId w:val="2"/>
+        </w:numPr>
+        <w:spacing w:after="120" w:line="360" w:lineRule="auto"/>
+        <w:jc w:val="both"/>
+        <w:rPr>
+          <w:lang w:val="pt-BR"/>
+        </w:rPr>
+      </w:pPr>
+      <w:r>
+        <w:rPr>
+          <w:lang w:val="pt-BR"/>
+        </w:rPr>
+        <w:t>Retreinar a camada de previsão sobre série municipal publicada no formato definido pela especificação de interface (3.6).</w:t>
+      </w:r>
+    </w:p>
+    <w:p>
+      <w:pPr>
+        <w:pStyle w:val="ListParagraph"/>
+        <w:numPr>
+          <w:ilvl w:val="0"/>
+          <w:numId w:val="2"/>
+        </w:numPr>
+        <w:spacing w:after="120" w:line="360" w:lineRule="auto"/>
+        <w:jc w:val="both"/>
+        <w:rPr>
+          <w:lang w:val="pt-BR"/>
+        </w:rPr>
+      </w:pPr>
+      <w:r>
+        <w:rPr>
+          <w:lang w:val="pt-BR"/>
+        </w:rPr>
+        <w:t>Investigar o ajuste automático da base de regras, por sistemas neuro-nebulosos ou por aprendizado por reforço, enfrentando a circularidade discutida em 2.6 (6.3).</w:t>
+      </w:r>
+    </w:p>
+    <w:p>
+      <w:pPr>
+        <w:pStyle w:val="ListParagraph"/>
+        <w:numPr>
+          <w:ilvl w:val="0"/>
+          <w:numId w:val="2"/>
+        </w:numPr>
+        <w:spacing w:after="120" w:line="360" w:lineRule="auto"/>
+        <w:jc w:val="both"/>
+        <w:rPr>
+          <w:lang w:val="pt-BR"/>
+        </w:rPr>
+      </w:pPr>
+      <w:r>
+        <w:rPr>
+          <w:lang w:val="pt-BR"/>
+        </w:rPr>
         <w:t>Realizar a integração efetiva com a plataforma municipal e com o sistema de telegestão, precedida do tratamento jurídico de proteção de dados que essa integração exige (3.10 e 6.3).</w:t>
       </w:r>
     </w:p>
@@ -23672,6 +25614,22 @@
         </w:rPr>
         <w:t>, v. 11, e20190061, 2019. DOI: 10.1590/2175-3369.011.e20190061.</w:t>
       </w:r>
+    </w:p>
+    <w:p>
+      <w:pPr>
+        <w:spacing w:after="240"/>
+        <w:rPr>
+          <w:ins w:id="30199" w:author="Vitor Oliveira" w:date="2026-09-28T12:00:00Z"/>
+        </w:rPr>
+      </w:pPr>
+      <w:ins w:id="30200" w:author="Vitor Oliveira" w:date="2026-09-28T12:00:00Z">
+        <w:r>
+          <w:rPr>
+            <w:lang w:val="pt-BR"/>
+          </w:rPr>
+          <w:t xml:space="preserve">AMERICAN NATIONAL STANDARDS INSTITUTE. ANSI C136.41-2013: American National Standard for Roadway and Area Lighting Equipment – Dimming Control Between an External Locking Type Photocontrol and Ballast or Driver. Rosslyn: National Electrical Manufacturers Association, 2013.</w:t>
+        </w:r>
+      </w:ins>
     </w:p>
     <w:p>
       <w:pPr>
@@ -24739,6 +26697,22 @@
       <w:pPr>
         <w:spacing w:after="240"/>
         <w:rPr>
+          <w:ins w:id="30201" w:author="Vitor Oliveira" w:date="2026-09-28T12:00:00Z"/>
+        </w:rPr>
+      </w:pPr>
+      <w:ins w:id="30202" w:author="Vitor Oliveira" w:date="2026-09-28T12:00:00Z">
+        <w:r>
+          <w:rPr>
+            <w:lang w:val="pt-BR"/>
+          </w:rPr>
+          <w:t xml:space="preserve">SÃO PAULO (Município). Edital de Chamamento Público nº 01/SMSU-GAB/2024: Programa Smart Sampa. São Paulo: Secretaria Municipal de Segurança Urbana, 2024. Publicado no Diário Oficial da Cidade de São Paulo em 5 jul. 2024. Disponível em: https://prefeitura.sp.gov.br/documents/d/seguranca_urbana/edital-de-chamamento-publicodocsp-diario-oficial-cidade-de-sao-paulo_05_07_2024-pdf. Acesso em: 27 set. 2026.</w:t>
+        </w:r>
+      </w:ins>
+    </w:p>
+    <w:p>
+      <w:pPr>
+        <w:spacing w:after="240"/>
+        <w:rPr>
           <w:lang w:val="pt-BR"/>
         </w:rPr>
       </w:pPr>
@@ -24785,11 +26759,81 @@
         <w:rPr>
           <w:lang w:val="pt-BR"/>
         </w:rPr>
-        <w:t xml:space="preserve">. São Paulo: Prefeitura do Município de São Paulo, 2026. Disponível em: https://dados.prefeitura.sp.gov.br/. </w:t>
+        <w:t xml:space="preserve">. São Paulo: </w:t>
+      </w:r>
+      <w:del w:id="30197" w:author="Vitor Oliveira" w:date="2026-09-28T12:00:00Z">
+        <w:r>
+          <w:rPr>
+            <w:lang w:val="pt-BR"/>
+          </w:rPr>
+          <w:delText xml:space="preserve">Prefeitura do Município de São Paulo, 2026.</w:delText>
+        </w:r>
+      </w:del>
+      <w:ins w:id="30198" w:author="Vitor Oliveira" w:date="2026-09-28T12:00:00Z">
+        <w:r>
+          <w:rPr>
+            <w:lang w:val="pt-BR"/>
+          </w:rPr>
+          <w:t xml:space="preserve">Prefeitura do Município de São Paulo, 2026a.</w:t>
+        </w:r>
+      </w:ins>
+      <w:r>
+        <w:rPr>
+          <w:lang w:val="pt-BR"/>
+        </w:rPr>
+        <w:t xml:space="preserve"> Disponível em: https://dados.prefeitura.sp.gov.br/. </w:t>
       </w:r>
       <w:r>
         <w:t>Acesso em: 12 set. 2026.</w:t>
       </w:r>
+    </w:p>
+    <w:p>
+      <w:pPr>
+        <w:spacing w:after="240"/>
+        <w:rPr>
+          <w:ins w:id="30203" w:author="Vitor Oliveira" w:date="2026-09-28T12:00:00Z"/>
+        </w:rPr>
+      </w:pPr>
+      <w:ins w:id="30204" w:author="Vitor Oliveira" w:date="2026-09-28T12:00:00Z">
+        <w:r>
+          <w:rPr>
+            <w:lang w:val="pt-BR"/>
+          </w:rPr>
+          <w:t xml:space="preserve">SÃO PAULO (Município). Smart Sampa chega a 50 mil câmeras e já supera em 25% o previsto no Programa de Metas. São Paulo: Secretaria Municipal de Segurança Urbana, 1 abr. 2026b. Disponível em: https://prefeitura.sp.gov.br/web/seguranca_urbana/w/smart-sampa-chega-a-50-mil-câmeras-e-já-supera-em-25-o-previsto-no-programa-de-metas. Acesso em: 27 set. 2026.</w:t>
+        </w:r>
+      </w:ins>
+    </w:p>
+    <w:p>
+      <w:pPr>
+        <w:spacing w:after="240"/>
+        <w:rPr>
+          <w:ins w:id="30205" w:author="Vitor Oliveira" w:date="2026-09-28T12:00:00Z"/>
+        </w:rPr>
+      </w:pPr>
+      <w:ins w:id="30206" w:author="Vitor Oliveira" w:date="2026-09-28T12:00:00Z">
+        <w:r>
+          <w:rPr>
+            <w:lang w:val="pt-BR"/>
+          </w:rPr>
+          <w:t xml:space="preserve">SÃO PAULO (Município). GeoSampa: camadas de iluminação pública e de segmentos de logradouro, serviço de feições geográficas (WFS). São Paulo: Prefeitura do Município de São Paulo, 2026c. Disponível em: https://wfs.geosampa.prefeitura.sp.gov.br/geoserver/geoportal/wfs. Acesso em: 27 set. 2026.</w:t>
+        </w:r>
+      </w:ins>
+    </w:p>
+    <w:p>
+      <w:pPr>
+        <w:spacing w:after="240"/>
+        <w:rPr>
+          <w:ins w:id="30207" w:author="Vitor Oliveira" w:date="2026-09-28T12:00:00Z"/>
+        </w:rPr>
+      </w:pPr>
+      <w:ins w:id="30208" w:author="Vitor Oliveira" w:date="2026-09-28T12:00:00Z">
+        <w:r>
+          <w:rPr>
+            <w:lang w:val="pt-BR"/>
+          </w:rPr>
+          <w:t xml:space="preserve">TALQ CONSORTIUM. TALQ Smart City Protocol: specification version 2.7.1. [S. l.]: TALQ Consortium, 16 abr. 2026. Disponível em: https://github.com/TALQ-consortium/TALQ_specification. Acesso em: 27 set. 2026.</w:t>
+        </w:r>
+      </w:ins>
     </w:p>
     <w:p>
       <w:pPr>

</xml_diff>